<commit_message>
feat: add faculty class management service with CRUD operations
feat: implement faculty user management service with validation and role handling

feat: create organizer service for managing clubs and organizing units

feat: add outbox service for handling event publishing and retries

feat: implement semester management service for CRUD operations

feat: create utility functions for attendance QR code generation and validation

feat: add CRUD error mapping utility for Prisma errors

feat: implement CRUD validation utilities for input validation

feat: create event description sanitization utilities

feat: add attendance worker for processing attendance scan requests
</commit_message>
<xml_diff>
--- a/Docs/DA_BC.docx
+++ b/Docs/DA_BC.docx
@@ -258,17 +258,9 @@
           <w:bCs/>
           <w:sz w:val="48"/>
           <w:szCs w:val="48"/>
-        </w:rPr>
-        <w:t xml:space="preserve">SMART </w:t>
-      </w:r>
-      <w:r>
-        <w:rPr>
-          <w:b/>
-          <w:bCs/>
-          <w:sz w:val="48"/>
-          <w:szCs w:val="48"/>
-        </w:rPr>
-        <w:t>TRAINING POINT</w:t>
+          <w:lang w:val="en-US"/>
+        </w:rPr>
+        <w:t>CONDUCT SCORE</w:t>
       </w:r>
       <w:r>
         <w:rPr>
@@ -748,18 +740,9 @@
           <w:bCs/>
           <w:sz w:val="48"/>
           <w:szCs w:val="48"/>
-        </w:rPr>
-        <w:t xml:space="preserve">SMART </w:t>
-      </w:r>
-      <w:r>
-        <w:rPr>
-          <w:b/>
-          <w:bCs/>
-          <w:sz w:val="48"/>
-          <w:szCs w:val="48"/>
-          <w:lang w:val="en-US"/>
-        </w:rPr>
-        <w:t>TRAINING POINT</w:t>
+          <w:lang w:val="en-US"/>
+        </w:rPr>
+        <w:t>CONDUCT SCORE</w:t>
       </w:r>
       <w:r>
         <w:rPr>
@@ -1072,17 +1055,7 @@
           <w:iCs/>
           <w:lang w:val="en-US"/>
         </w:rPr>
-        <w:t xml:space="preserve">Smart </w:t>
-      </w:r>
-      <w:r>
-        <w:rPr>
-          <w:b/>
-          <w:bCs/>
-          <w:i/>
-          <w:iCs/>
-          <w:lang w:val="en-US"/>
-        </w:rPr>
-        <w:t>training point</w:t>
+        <w:t>Conduct Score</w:t>
       </w:r>
       <w:r>
         <w:rPr>
@@ -3136,8 +3109,9 @@
               <w:rPr>
                 <w:rStyle w:val="Hyperlink"/>
                 <w:noProof/>
-              </w:rPr>
-              <w:t>training point</w:t>
+                <w:lang w:val="en-US"/>
+              </w:rPr>
+              <w:t>conduct score</w:t>
             </w:r>
             <w:r>
               <w:rPr>
@@ -3236,7 +3210,7 @@
                 <w:rStyle w:val="Hyperlink"/>
                 <w:noProof/>
               </w:rPr>
-              <w:t>training point</w:t>
+              <w:t>conduct score</w:t>
             </w:r>
             <w:r>
               <w:rPr>
@@ -8921,7 +8895,25 @@
         </w:rPr>
       </w:pPr>
       <w:r>
-        <w:t>Training points are an important indicator of student development, but managing them at universities is often slow and heavily dependent on manual work. Scanning student card barcodes at events has made attendance faster, yet the process after scanning remains complicated. Event data must pass through several people, be filtered in Excel, and then sent to administrators for entry into the system. As a result, students may have to wait several weeks, or even a month, before their scores are updated.</w:t>
+        <w:rPr>
+          <w:lang w:val="en-US"/>
+        </w:rPr>
+        <w:t>C</w:t>
+      </w:r>
+      <w:r>
+        <w:t>onduct score</w:t>
+      </w:r>
+      <w:r>
+        <w:rPr>
+          <w:lang w:val="en-US"/>
+        </w:rPr>
+        <w:t>s</w:t>
+      </w:r>
+      <w:r>
+        <w:t xml:space="preserve"> </w:t>
+      </w:r>
+      <w:r>
+        <w:t>are an important indicator of student development, but managing them at universities is often slow and heavily dependent on manual work. Scanning student card barcodes at events has made attendance faster, yet the process after scanning remains complicated. Event data must pass through several people, be filtered in Excel, and then sent to administrators for entry into the system. As a result, students may have to wait several weeks, or even a month, before their scores are updated.</w:t>
       </w:r>
     </w:p>
     <w:p>
@@ -8947,10 +8939,25 @@
         </w:rPr>
       </w:pPr>
       <w:r>
-        <w:t xml:space="preserve">The Smart </w:t>
-      </w:r>
-      <w:r>
-        <w:t>Training Point</w:t>
+        <w:t>The</w:t>
+      </w:r>
+      <w:r>
+        <w:rPr>
+          <w:lang w:val="en-US"/>
+        </w:rPr>
+        <w:t xml:space="preserve"> C</w:t>
+      </w:r>
+      <w:r>
+        <w:t xml:space="preserve">onduct </w:t>
+      </w:r>
+      <w:r>
+        <w:rPr>
+          <w:lang w:val="en-US"/>
+        </w:rPr>
+        <w:t>S</w:t>
+      </w:r>
+      <w:r>
+        <w:t>core</w:t>
       </w:r>
       <w:r>
         <w:t xml:space="preserve"> Management system was developed to address these problems. Attendance data is sent directly from the card reader to the database in real time, removing unnecessary manual steps. A personalized dashboard allows students to check their current scores, receive alerts when they are short of points, and find suitable events to register for.</w:t>
@@ -9013,7 +9020,19 @@
       </w:r>
       <w:r>
         <w:lastRenderedPageBreak/>
-        <w:t>ins occur instantaneously via barcodes, personal QR codes, or GPS Geofencing at event venues to eliminate proxy attendance. Simultaneously, the Smart Advisor engine automatically calculates remaining required training points and cross</w:t>
+        <w:t xml:space="preserve">ins occur instantaneously via barcodes, personal QR codes, or GPS Geofencing at event venues to eliminate proxy attendance. Simultaneously, the Smart Advisor engine automatically calculates remaining required </w:t>
+      </w:r>
+      <w:r>
+        <w:t>conduct score</w:t>
+      </w:r>
+      <w:r>
+        <w:rPr>
+          <w:lang w:val="en-US"/>
+        </w:rPr>
+        <w:t>s</w:t>
+      </w:r>
+      <w:r>
+        <w:t xml:space="preserve"> and cross</w:t>
       </w:r>
       <w:r>
         <w:t>-</w:t>
@@ -9072,7 +9091,31 @@
         </w:rPr>
       </w:pPr>
       <w:r>
-        <w:t>The project designs, develops, and tests a Smart Training Point Management and Recommendation System for supporting student activities at the university level. The system focuses on several conduct-score processes, including event publication, real-time attendance tracking, automatic score calculation, activity recommendations, and online evidence submission. The project does not cover other functions of a University Information System, such as academic grade management, tuition payments, or disciplinary records.</w:t>
+        <w:t>The project designs, develops, and tests a</w:t>
+      </w:r>
+      <w:r>
+        <w:rPr>
+          <w:lang w:val="en-US"/>
+        </w:rPr>
+        <w:t xml:space="preserve"> C</w:t>
+      </w:r>
+      <w:r>
+        <w:t xml:space="preserve">onduct </w:t>
+      </w:r>
+      <w:r>
+        <w:rPr>
+          <w:lang w:val="en-US"/>
+        </w:rPr>
+        <w:t>S</w:t>
+      </w:r>
+      <w:r>
+        <w:t>core</w:t>
+      </w:r>
+      <w:r>
+        <w:t xml:space="preserve"> </w:t>
+      </w:r>
+      <w:r>
+        <w:t>Management and Recommendation System for supporting student activities at the university level. The system focuses on several conduct-score processes, including event publication, real-time attendance tracking, automatic score calculation, activity recommendations, and online evidence submission. The project does not cover other functions of a University Information System, such as academic grade management, tuition payments, or disciplinary records.</w:t>
       </w:r>
     </w:p>
     <w:p>
@@ -9118,37 +9161,82 @@
         </w:rPr>
       </w:pPr>
       <w:r>
-        <w:t>The system supports several administrative tasks related to training point management. After an event, staff can process participant lists and update student records with less manual data entry. This can reduce the time required to enter scores and help limit errors during the process. Training point records are also updated across the system more quickly.</w:t>
-      </w:r>
-    </w:p>
-    <w:p>
-      <w:pPr>
-        <w:rPr>
-          <w:lang w:val="en-US"/>
-        </w:rPr>
-      </w:pPr>
-      <w:r>
-        <w:t>Students can check their accumulated training points and review activity records online. When they need to request a review or correction, they can submit an appeal through the system instead of visiting different administrative offices.</w:t>
-      </w:r>
-    </w:p>
-    <w:p>
-      <w:pPr>
-        <w:rPr>
-          <w:lang w:val="en-US"/>
-        </w:rPr>
-      </w:pPr>
-      <w:r>
-        <w:t>Administrative staff can review training point data, assign scores based on stored activity records, and generate reports for end-of-term evaluation. Relevant information is stored in one system rather than being managed through separate files or manual records.</w:t>
-      </w:r>
-    </w:p>
-    <w:p>
-      <w:pPr>
-        <w:rPr>
-          <w:lang w:val="en-US"/>
-        </w:rPr>
-      </w:pPr>
-      <w:r>
-        <w:t>The current system focuses on training point management. Some of its functions, such as data collection, verification, and online record management, could be adapted for other administrative processes if their requirements are similar.</w:t>
+        <w:t xml:space="preserve">The system supports several administrative tasks related to </w:t>
+      </w:r>
+      <w:r>
+        <w:t>conduct score</w:t>
+      </w:r>
+      <w:r>
+        <w:t xml:space="preserve"> </w:t>
+      </w:r>
+      <w:r>
+        <w:t xml:space="preserve">management. After an event, staff can process participant lists and update student records with less manual data entry. This can reduce the time required to enter scores and help limit errors during the process. </w:t>
+      </w:r>
+      <w:r>
+        <w:rPr>
+          <w:lang w:val="en-US"/>
+        </w:rPr>
+        <w:t>C</w:t>
+      </w:r>
+      <w:r>
+        <w:t>onduct score</w:t>
+      </w:r>
+      <w:r>
+        <w:t xml:space="preserve"> </w:t>
+      </w:r>
+      <w:r>
+        <w:t>records are also updated across the system more quickly.</w:t>
+      </w:r>
+    </w:p>
+    <w:p>
+      <w:pPr>
+        <w:rPr>
+          <w:lang w:val="en-US"/>
+        </w:rPr>
+      </w:pPr>
+      <w:r>
+        <w:t xml:space="preserve">Students can check their accumulated </w:t>
+      </w:r>
+      <w:r>
+        <w:t>conduct score</w:t>
+      </w:r>
+      <w:r>
+        <w:t>s and review activity records online. When they need to request a review or correction, they can submit an appeal through the system instead of visiting different administrative offices.</w:t>
+      </w:r>
+    </w:p>
+    <w:p>
+      <w:pPr>
+        <w:rPr>
+          <w:lang w:val="en-US"/>
+        </w:rPr>
+      </w:pPr>
+      <w:r>
+        <w:t xml:space="preserve">Administrative staff can review </w:t>
+      </w:r>
+      <w:r>
+        <w:t>conduct score</w:t>
+      </w:r>
+      <w:r>
+        <w:t xml:space="preserve"> data, assign scores based on stored activity records, and generate reports for end-of-term evaluation. Relevant information is stored in one system rather than being managed through separate files or manual records.</w:t>
+      </w:r>
+    </w:p>
+    <w:p>
+      <w:pPr>
+        <w:rPr>
+          <w:lang w:val="en-US"/>
+        </w:rPr>
+      </w:pPr>
+      <w:r>
+        <w:t xml:space="preserve">The current system focuses on </w:t>
+      </w:r>
+      <w:r>
+        <w:t>conduct score</w:t>
+      </w:r>
+      <w:r>
+        <w:t xml:space="preserve"> </w:t>
+      </w:r>
+      <w:r>
+        <w:t>management. Some of its functions, such as data collection, verification, and online record management, could be adapted for other administrative processes if their requirements are similar.</w:t>
       </w:r>
       <w:r>
         <w:t>.</w:t>
@@ -9528,7 +9616,19 @@
         </w:rPr>
       </w:pPr>
       <w:r>
-        <w:t>Managing and evaluating student training points is part of the student assessment process at higher education institutions. As the number of students increases, managing training point records and applying evaluation regulations can become more difficult when using traditional methods. This creates a need for systems that can support data processing and score management.</w:t>
+        <w:t xml:space="preserve">Managing and evaluating student </w:t>
+      </w:r>
+      <w:r>
+        <w:t>conduct score</w:t>
+      </w:r>
+      <w:r>
+        <w:t xml:space="preserve">s is part of the student assessment process at higher education institutions. As the number of students increases, managing </w:t>
+      </w:r>
+      <w:r>
+        <w:t>conduct score</w:t>
+      </w:r>
+      <w:r>
+        <w:t xml:space="preserve"> records and applying evaluation regulations can become more difficult when using traditional methods. This creates a need for systems that can support data processing and score management.</w:t>
       </w:r>
     </w:p>
     <w:p>
@@ -9556,13 +9656,7 @@
         <w:t xml:space="preserve">existing </w:t>
       </w:r>
       <w:r>
-        <w:t>trainin</w:t>
-      </w:r>
-      <w:r>
-        <w:t xml:space="preserve">g </w:t>
-      </w:r>
-      <w:r>
-        <w:t>point</w:t>
+        <w:t>conduct score</w:t>
       </w:r>
       <w:r>
         <w:t xml:space="preserve"> management systems</w:t>
@@ -9576,7 +9670,19 @@
         </w:rPr>
       </w:pPr>
       <w:r>
-        <w:t>Managing and evaluating student training points is a common part of student administration at universities. Training point records are used to document student participation in academic, extracurricular, and other university activities. Universities and functional departments can use these records during the student evaluation process. However, the procedures for collecting activity data, assigning scores, and managing student records still involve several practical difficulties.</w:t>
+        <w:t xml:space="preserve">Managing and evaluating student </w:t>
+      </w:r>
+      <w:r>
+        <w:t>conduct score</w:t>
+      </w:r>
+      <w:r>
+        <w:t xml:space="preserve">s is a common part of student administration at universities. </w:t>
+      </w:r>
+      <w:r>
+        <w:t>Conduct score</w:t>
+      </w:r>
+      <w:r>
+        <w:t xml:space="preserve"> records are used to document student participation in academic, extracurricular, and other university activities. Universities and functional departments can use these records during the student evaluation process. However, the procedures for collecting activity data, assigning scores, and managing student records still involve several practical difficulties.</w:t>
       </w:r>
     </w:p>
     <w:p>
@@ -9593,17 +9699,29 @@
       </w:pPr>
       <w:r>
         <w:lastRenderedPageBreak/>
-        <w:t>Student involvement in monitoring training points is another issue. Some students pay more attention to their records near the end of the evaluation period or when they need to provide evidence for previous activities. This can make it difficult for them to identify missing criteria early in the semester. Providing access to current score records and activity information may help students follow their progress throughout the evaluation period. The system can also display activities that match criteria the student has not yet completed.</w:t>
-      </w:r>
-    </w:p>
-    <w:p>
-      <w:pPr>
-        <w:rPr>
-          <w:lang w:val="en-US"/>
-        </w:rPr>
-      </w:pPr>
-      <w:r>
-        <w:t>Collecting and managing activity data can also require considerable administrative work. A single event may involve several organizing units, a large number of students, and different attendance or verification methods. When information is collected from separate sources and processed manually, staff must verify records before assigning training points. This process can lead to duplicate records, data entry errors, or delays in updating student information.</w:t>
+        <w:t xml:space="preserve">Student involvement in monitoring </w:t>
+      </w:r>
+      <w:r>
+        <w:t>conduct score</w:t>
+      </w:r>
+      <w:r>
+        <w:t>s is another issue. Some students pay more attention to their records near the end of the evaluation period or when they need to provide evidence for previous activities. This can make it difficult for them to identify missing criteria early in the semester. Providing access to current score records and activity information may help students follow their progress throughout the evaluation period. The system can also display activities that match criteria the student has not yet completed.</w:t>
+      </w:r>
+    </w:p>
+    <w:p>
+      <w:pPr>
+        <w:rPr>
+          <w:lang w:val="en-US"/>
+        </w:rPr>
+      </w:pPr>
+      <w:r>
+        <w:t xml:space="preserve">Collecting and managing activity data can also require considerable administrative work. A single event may involve several organizing units, a large number of students, and different attendance or verification methods. When information is collected from separate sources and processed manually, staff must verify records before assigning </w:t>
+      </w:r>
+      <w:r>
+        <w:t>conduct score</w:t>
+      </w:r>
+      <w:r>
+        <w:t>s. This process can lead to duplicate records, data entry errors, or delays in updating student information.</w:t>
       </w:r>
     </w:p>
     <w:p>
@@ -9623,7 +9741,19 @@
         </w:rPr>
       </w:pPr>
       <w:r>
-        <w:t>These issues define the main requirements for the proposed training point management system. The system is intended to support the collection and management of activity records, attendance verification, score processing, and student access to training point information. It can also provide activity information based on relevant evaluation criteria. For administrative staff, the system can reduce some manual data processing and provide reports based on stored records. The effectiveness of these functions will be evaluated within the scope of the project.</w:t>
+        <w:t xml:space="preserve">These issues define the main requirements for the proposed </w:t>
+      </w:r>
+      <w:r>
+        <w:t>conduct score</w:t>
+      </w:r>
+      <w:r>
+        <w:t xml:space="preserve"> management system. The system is intended to support the collection and management of activity records, attendance verification, score processing, and student access to </w:t>
+      </w:r>
+      <w:r>
+        <w:t>conduct score</w:t>
+      </w:r>
+      <w:r>
+        <w:t xml:space="preserve"> information. It can also provide activity information based on relevant evaluation criteria. For administrative staff, the system can reduce some manual data processing and provide reports based on stored records. The effectiveness of these functions will be evaluated within the scope of the project.</w:t>
       </w:r>
     </w:p>
     <w:p>
@@ -9923,7 +10053,7 @@
           <w:lang w:val="en-US"/>
         </w:rPr>
         <w:drawing>
-          <wp:inline distT="0" distB="0" distL="0" distR="0" wp14:anchorId="237A60CE" wp14:editId="5213F873">
+          <wp:inline distT="0" distB="0" distL="0" distR="0" wp14:anchorId="237A60CE" wp14:editId="3719D538">
             <wp:extent cx="5645150" cy="2567940"/>
             <wp:effectExtent l="0" t="0" r="0" b="3810"/>
             <wp:docPr id="1" name="Picture 1"/>
@@ -10156,7 +10286,19 @@
         <w:rPr>
           <w:lang w:val="en-US"/>
         </w:rPr>
-        <w:t>Event-Driven Architecture (EDA) is a software architecture pattern in which system components communicate through events. An event represents a change in the state of the system that may require further processing. In an attendance and training point management system, examples include a student submitting an attendance request</w:t>
+        <w:t xml:space="preserve">Event-Driven Architecture (EDA) is a software architecture pattern in which system components communicate through events. An event represents a change in the state of the system that may require further processing. In an attendance and </w:t>
+      </w:r>
+      <w:r>
+        <w:rPr>
+          <w:lang w:val="en-US"/>
+        </w:rPr>
+        <w:t>conduct score</w:t>
+      </w:r>
+      <w:r>
+        <w:rPr>
+          <w:lang w:val="en-US"/>
+        </w:rPr>
+        <w:t xml:space="preserve"> management system, examples include a student submitting an attendance request</w:t>
       </w:r>
       <w:r>
         <w:rPr>
@@ -10168,7 +10310,19 @@
         <w:rPr>
           <w:lang w:val="en-US"/>
         </w:rPr>
-        <w:t xml:space="preserve">the system confirming the student's location, and a training point </w:t>
+        <w:t xml:space="preserve">the system confirming the student's location, and a </w:t>
+      </w:r>
+      <w:r>
+        <w:rPr>
+          <w:lang w:val="en-US"/>
+        </w:rPr>
+        <w:t>conduct score</w:t>
+      </w:r>
+      <w:r>
+        <w:rPr>
+          <w:lang w:val="en-US"/>
+        </w:rPr>
+        <w:t xml:space="preserve"> </w:t>
       </w:r>
       <w:proofErr w:type="gramStart"/>
       <w:r>
@@ -10401,7 +10555,13 @@
         </w:rPr>
       </w:pPr>
       <w:r>
-        <w:t>Conduct Score Engine: Receives the validated check-in result, updates the attendance record, and calculates the corresponding training points.</w:t>
+        <w:t xml:space="preserve">Conduct Score Engine: Receives the validated check-in result, updates the attendance record, and calculates the corresponding </w:t>
+      </w:r>
+      <w:r>
+        <w:t>conduct score</w:t>
+      </w:r>
+      <w:r>
+        <w:t>s.</w:t>
       </w:r>
     </w:p>
     <w:p>
@@ -10469,7 +10629,19 @@
         <w:rPr>
           <w:lang w:val="en-US"/>
         </w:rPr>
-        <w:t xml:space="preserve">Faster initial response: After a student submits an attendance request, the system can return a request acknowledgement before completing the remaining processing steps. Tasks such as Haversine distance calculation, QR or barcode validation, PostgreSQL updates, and training point calculation can be handled by </w:t>
+        <w:t xml:space="preserve">Faster initial response: After a student submits an attendance request, the system can return a request acknowledgement before completing the remaining processing steps. Tasks such as Haversine distance calculation, QR or barcode validation, PostgreSQL updates, and </w:t>
+      </w:r>
+      <w:r>
+        <w:rPr>
+          <w:lang w:val="en-US"/>
+        </w:rPr>
+        <w:t>conduct score</w:t>
+      </w:r>
+      <w:r>
+        <w:rPr>
+          <w:lang w:val="en-US"/>
+        </w:rPr>
+        <w:t xml:space="preserve"> calculation can be handled by </w:t>
       </w:r>
       <w:r>
         <w:rPr>
@@ -10535,7 +10707,7 @@
           <w:lang w:val="en-US"/>
         </w:rPr>
         <w:drawing>
-          <wp:inline distT="0" distB="0" distL="0" distR="0" wp14:anchorId="66FCC70D" wp14:editId="1477C6D8">
+          <wp:inline distT="0" distB="0" distL="0" distR="0" wp14:anchorId="66FCC70D" wp14:editId="764B055E">
             <wp:extent cx="5570220" cy="2193290"/>
             <wp:effectExtent l="0" t="0" r="0" b="0"/>
             <wp:docPr id="2" name="Picture 2"/>
@@ -10877,7 +11049,7 @@
         <w:t>Al</w:t>
       </w:r>
       <w:r>
-        <w:t xml:space="preserve"> gorithm</w:t>
+        <w:t>gorithm</w:t>
       </w:r>
       <w:r>
         <w:rPr>
@@ -11004,7 +11176,19 @@
         <w:rPr>
           <w:lang w:val="en-US"/>
         </w:rPr>
-        <w:t>. Background workers can then process tasks that do not need to be completed before the initial response, including attendance validation, database updates, or training point calculations. The request flow can therefore be represented as:</w:t>
+        <w:t xml:space="preserve">. Background workers can then process tasks that do not need to be completed before the initial response, including attendance validation, database updates, or </w:t>
+      </w:r>
+      <w:r>
+        <w:rPr>
+          <w:lang w:val="en-US"/>
+        </w:rPr>
+        <w:t>conduct score</w:t>
+      </w:r>
+      <w:r>
+        <w:rPr>
+          <w:lang w:val="en-US"/>
+        </w:rPr>
+        <w:t xml:space="preserve"> calculations. The request flow can therefore be represented as:</w:t>
       </w:r>
       <w:r>
         <w:rPr>
@@ -11732,6 +11916,7 @@
     <w:p>
       <w:pPr>
         <w:rPr>
+          <w:rFonts w:ascii="monospace" w:hAnsi="monospace"/>
           <w:lang w:val="en-US"/>
         </w:rPr>
       </w:pPr>
@@ -11749,35 +11934,287 @@
       </w:r>
       <w:proofErr w:type="gramStart"/>
       <w:r>
+        <w:rPr>
+          <w:rFonts w:ascii="monospace" w:hAnsi="monospace"/>
+          <w:lang w:val="en-US"/>
+        </w:rPr>
+        <w:t>lock:checkin</w:t>
+      </w:r>
+      <w:proofErr w:type="gramEnd"/>
+      <w:r>
+        <w:rPr>
+          <w:rFonts w:ascii="monospace" w:hAnsi="monospace"/>
+          <w:lang w:val="en-US"/>
+        </w:rPr>
+        <w:t>:{eventId}:{studentId}</w:t>
+      </w:r>
+    </w:p>
+    <w:p>
+      <w:pPr>
+        <w:rPr>
+          <w:lang w:val="en-US"/>
+        </w:rPr>
+      </w:pPr>
+      <w:r>
+        <w:rPr>
+          <w:lang w:val="en-US"/>
+        </w:rPr>
+        <w:lastRenderedPageBreak/>
+        <w:t>The key is created using the Redis command:</w:t>
+      </w:r>
+      <w:r>
+        <w:rPr>
+          <w:lang w:val="en-US"/>
+        </w:rPr>
+        <w:t xml:space="preserve"> </w:t>
+      </w:r>
+      <w:r>
+        <w:rPr>
+          <w:rFonts w:ascii="monospace" w:hAnsi="monospace"/>
+          <w:lang w:val="en-US"/>
+        </w:rPr>
+        <w:t>SET key value NX EX ttl</w:t>
+      </w:r>
+    </w:p>
+    <w:p>
+      <w:pPr>
+        <w:rPr>
+          <w:lang w:val="en-US"/>
+        </w:rPr>
+      </w:pPr>
+      <w:r>
+        <w:rPr>
+          <w:lang w:val="en-US"/>
+        </w:rPr>
+        <w:t xml:space="preserve">The NX option means that the key can only be created if it does not already exist. The </w:t>
+      </w:r>
+      <w:r>
+        <w:rPr>
+          <w:lang w:val="en-US"/>
+        </w:rPr>
+        <w:t>N</w:t>
+      </w:r>
+      <w:r>
+        <w:rPr>
+          <w:lang w:val="en-US"/>
+        </w:rPr>
+        <w:t>X</w:t>
+      </w:r>
+      <w:r>
+        <w:rPr>
+          <w:lang w:val="en-US"/>
+        </w:rPr>
+        <w:t xml:space="preserve"> </w:t>
+      </w:r>
+      <w:r>
+        <w:rPr>
+          <w:lang w:val="en-US"/>
+        </w:rPr>
+        <w:t>option sets an expiration time for the key. In this case, the TTL is set to 10 seconds.</w:t>
+      </w:r>
+    </w:p>
+    <w:p>
+      <w:pPr>
+        <w:rPr>
+          <w:lang w:val="en-US"/>
+        </w:rPr>
+      </w:pPr>
+      <w:r>
+        <w:rPr>
+          <w:lang w:val="en-US"/>
+        </w:rPr>
+        <w:t>When the first request is received, Redis creates the key. If another request with the same eventId and studentId is sent while the key still exists, Redis does not create a new key. The API Server can then treat the request as a duplicate and stop it before performing additional database operations.</w:t>
+      </w:r>
+    </w:p>
+    <w:p>
+      <w:pPr>
+        <w:pStyle w:val="Heading4"/>
+        <w:rPr>
+          <w:lang w:val="en-US"/>
+        </w:rPr>
+      </w:pPr>
+      <w:r>
+        <w:t>Cache-Aside Strategy for Frequently Accessed Data</w:t>
+      </w:r>
+    </w:p>
+    <w:p>
+      <w:pPr>
+        <w:rPr>
+          <w:lang w:val="en-US"/>
+        </w:rPr>
+      </w:pPr>
+      <w:r>
+        <w:rPr>
+          <w:lang w:val="en-US"/>
+        </w:rPr>
+        <w:t>Some information is requested many times during an attendance session but does not change often. Examples include event information, the list of eligible students, and the GPS geofence configuration.</w:t>
+      </w:r>
+    </w:p>
+    <w:p>
+      <w:pPr>
+        <w:rPr>
+          <w:lang w:val="en-US"/>
+        </w:rPr>
+      </w:pPr>
+      <w:r>
+        <w:rPr>
+          <w:lang w:val="en-US"/>
+        </w:rPr>
+        <w:t>This data can be stored in Redis as JSON strings. The application uses the Cache-Aside pattern. The API Server first checks Redis for the requested data. If the data is available, it is returned from the cache. If not, the API Server retrieves it from PostgreSQL and stores it in Redis before returning the result.</w:t>
+      </w:r>
+    </w:p>
+    <w:p>
+      <w:pPr>
+        <w:rPr>
+          <w:lang w:val="en-US"/>
+        </w:rPr>
+      </w:pPr>
+      <w:r>
+        <w:rPr>
+          <w:lang w:val="en-US"/>
+        </w:rPr>
+        <w:t>Using this approach reduces repeated database queries when many students access the same event information at the same time. The actual effect depends on how often the cached data is requested and how frequently it changes.</w:t>
+      </w:r>
+    </w:p>
+    <w:p>
+      <w:pPr>
+        <w:pStyle w:val="Heading4"/>
+        <w:rPr>
+          <w:lang w:val="en-US"/>
+        </w:rPr>
+      </w:pPr>
+      <w:r>
+        <w:t>Attendance Counter</w:t>
+      </w:r>
+    </w:p>
+    <w:p>
+      <w:pPr>
+        <w:rPr>
+          <w:lang w:val="en-US"/>
+        </w:rPr>
+      </w:pPr>
+      <w:r>
+        <w:rPr>
+          <w:lang w:val="en-US"/>
+        </w:rPr>
+        <w:t xml:space="preserve">The system keeps an attendance counter in Redis so that the </w:t>
+      </w:r>
+      <w:r>
+        <w:rPr>
+          <w:lang w:val="en-US"/>
+        </w:rPr>
+        <w:t xml:space="preserve">organizers' </w:t>
+      </w:r>
+      <w:r>
+        <w:rPr>
+          <w:lang w:val="en-US"/>
+        </w:rPr>
+        <w:t xml:space="preserve">dashboard can display the current number of students who have successfully checked in. This avoids querying PostgreSQL with </w:t>
+      </w:r>
+      <w:proofErr w:type="gramStart"/>
+      <w:r>
+        <w:rPr>
+          <w:lang w:val="en-US"/>
+        </w:rPr>
+        <w:t>COUNT(</w:t>
+      </w:r>
+      <w:proofErr w:type="gramEnd"/>
+      <w:r>
+        <w:rPr>
+          <w:lang w:val="en-US"/>
+        </w:rPr>
+        <w:t>*) every time the dashboard needs an updated number.</w:t>
+      </w:r>
+    </w:p>
+    <w:p>
+      <w:pPr>
+        <w:rPr>
+          <w:lang w:val="en-US"/>
+        </w:rPr>
+      </w:pPr>
+      <w:r>
+        <w:rPr>
+          <w:lang w:val="en-US"/>
+        </w:rPr>
+        <w:t>After a check-in is successfully processed, the system increases the counter for that event using the Redis INCR comman</w:t>
+      </w:r>
+      <w:r>
+        <w:rPr>
+          <w:lang w:val="en-US"/>
+        </w:rPr>
+        <w:t>d</w:t>
+      </w:r>
+    </w:p>
+    <w:p>
+      <w:pPr>
+        <w:rPr>
+          <w:lang w:val="en-US"/>
+        </w:rPr>
+      </w:pPr>
+      <w:r>
+        <w:rPr>
+          <w:lang w:val="en-US"/>
+        </w:rPr>
+        <w:t>The INCR operation is atomic, so multiple requests can update the same counter without interfering with each other.</w:t>
+      </w:r>
+    </w:p>
+    <w:p>
+      <w:pPr>
+        <w:rPr>
+          <w:lang w:val="en-US"/>
+        </w:rPr>
+      </w:pPr>
+      <w:r>
+        <w:rPr>
+          <w:lang w:val="en-US"/>
+        </w:rPr>
+        <w:lastRenderedPageBreak/>
+        <w:t>A background worker or notification service can read the current value and send updates to connected dashboards through Server-Sent Events (SSE).</w:t>
+      </w:r>
+    </w:p>
+    <w:p>
+      <w:pPr>
+        <w:pStyle w:val="Heading4"/>
+        <w:rPr>
+          <w:lang w:val="en-US"/>
+        </w:rPr>
+      </w:pPr>
+      <w:r>
+        <w:t>Application-Level Rate Limiting</w:t>
+      </w:r>
+    </w:p>
+    <w:p>
+      <w:pPr>
+        <w:rPr>
+          <w:lang w:val="en-US"/>
+        </w:rPr>
+      </w:pPr>
+      <w:r>
+        <w:t>Redis is also used to limit the number of check-in requests sent by each student. This works together with the rate-limiting configuration at the Nginx layer</w:t>
+      </w:r>
+      <w:r>
+        <w:rPr>
+          <w:lang w:val="en-US"/>
+        </w:rPr>
+        <w:t>.</w:t>
+      </w:r>
+    </w:p>
+    <w:p>
+      <w:pPr>
         <w:rPr>
           <w:i/>
           <w:iCs/>
           <w:lang w:val="en-US"/>
         </w:rPr>
-        <w:t>lock:checkin</w:t>
-      </w:r>
-      <w:proofErr w:type="gramEnd"/>
-      <w:r>
-        <w:rPr>
-          <w:i/>
-          <w:iCs/>
-          <w:lang w:val="en-US"/>
-        </w:rPr>
-        <w:t>:{eventId}:{studentId}</w:t>
-      </w:r>
-    </w:p>
-    <w:p>
-      <w:pPr>
-        <w:rPr>
-          <w:lang w:val="en-US"/>
-        </w:rPr>
-      </w:pPr>
-      <w:r>
-        <w:rPr>
-          <w:lang w:val="en-US"/>
-        </w:rPr>
-        <w:lastRenderedPageBreak/>
-        <w:t>The key is created using the Redis command:</w:t>
+      </w:pPr>
+      <w:r>
+        <w:t>The system uses a Redis Sorted Set (ZSET) to implement a sliding window. Each request is stored with its timestamp in a key with the following format</w:t>
+      </w:r>
+      <w:r>
+        <w:rPr>
+          <w:lang w:val="en-US"/>
+        </w:rPr>
+        <w:t>:</w:t>
       </w:r>
       <w:r>
         <w:rPr>
@@ -11787,249 +12224,7 @@
       </w:r>
       <w:r>
         <w:rPr>
-          <w:lang w:val="en-US"/>
-        </w:rPr>
-        <w:t>SET key value NX EX ttl</w:t>
-      </w:r>
-    </w:p>
-    <w:p>
-      <w:pPr>
-        <w:rPr>
-          <w:lang w:val="en-US"/>
-        </w:rPr>
-      </w:pPr>
-      <w:r>
-        <w:rPr>
-          <w:lang w:val="en-US"/>
-        </w:rPr>
-        <w:t xml:space="preserve">The NX option means that the key can only be created if it does not already exist. The </w:t>
-      </w:r>
-      <w:r>
-        <w:rPr>
-          <w:lang w:val="en-US"/>
-        </w:rPr>
-        <w:t>N</w:t>
-      </w:r>
-      <w:r>
-        <w:rPr>
-          <w:lang w:val="en-US"/>
-        </w:rPr>
-        <w:t>X</w:t>
-      </w:r>
-      <w:r>
-        <w:rPr>
-          <w:lang w:val="en-US"/>
-        </w:rPr>
-        <w:t xml:space="preserve"> </w:t>
-      </w:r>
-      <w:r>
-        <w:rPr>
-          <w:lang w:val="en-US"/>
-        </w:rPr>
-        <w:t>option sets an expiration time for the key. In this case, the TTL is set to 10 seconds.</w:t>
-      </w:r>
-    </w:p>
-    <w:p>
-      <w:pPr>
-        <w:rPr>
-          <w:lang w:val="en-US"/>
-        </w:rPr>
-      </w:pPr>
-      <w:r>
-        <w:rPr>
-          <w:lang w:val="en-US"/>
-        </w:rPr>
-        <w:t>When the first request is received, Redis creates the key. If another request with the same eventId and studentId is sent while the key still exists, Redis does not create a new key. The API Server can then treat the request as a duplicate and stop it before performing additional database operations.</w:t>
-      </w:r>
-    </w:p>
-    <w:p>
-      <w:pPr>
-        <w:pStyle w:val="Heading4"/>
-        <w:rPr>
-          <w:lang w:val="en-US"/>
-        </w:rPr>
-      </w:pPr>
-      <w:r>
-        <w:t>Cache-Aside Strategy for Frequently Accessed Data</w:t>
-      </w:r>
-    </w:p>
-    <w:p>
-      <w:pPr>
-        <w:rPr>
-          <w:lang w:val="en-US"/>
-        </w:rPr>
-      </w:pPr>
-      <w:r>
-        <w:rPr>
-          <w:lang w:val="en-US"/>
-        </w:rPr>
-        <w:t>Some information is requested many times during an attendance session but does not change often. Examples include event information, the list of eligible students, and the GPS geofence configuration.</w:t>
-      </w:r>
-    </w:p>
-    <w:p>
-      <w:pPr>
-        <w:rPr>
-          <w:lang w:val="en-US"/>
-        </w:rPr>
-      </w:pPr>
-      <w:r>
-        <w:rPr>
-          <w:lang w:val="en-US"/>
-        </w:rPr>
-        <w:t>This data can be stored in Redis as JSON strings. The application uses the Cache-Aside pattern. The API Server first checks Redis for the requested data. If the data is available, it is returned from the cache. If not, the API Server retrieves it from PostgreSQL and stores it in Redis before returning the result.</w:t>
-      </w:r>
-    </w:p>
-    <w:p>
-      <w:pPr>
-        <w:rPr>
-          <w:lang w:val="en-US"/>
-        </w:rPr>
-      </w:pPr>
-      <w:r>
-        <w:rPr>
-          <w:lang w:val="en-US"/>
-        </w:rPr>
-        <w:t>Using this approach reduces repeated database queries when many students access the same event information at the same time. The actual effect depends on how often the cached data is requested and how frequently it changes.</w:t>
-      </w:r>
-    </w:p>
-    <w:p>
-      <w:pPr>
-        <w:pStyle w:val="Heading4"/>
-        <w:rPr>
-          <w:lang w:val="en-US"/>
-        </w:rPr>
-      </w:pPr>
-      <w:r>
-        <w:t>Attendance Counter</w:t>
-      </w:r>
-    </w:p>
-    <w:p>
-      <w:pPr>
-        <w:rPr>
-          <w:lang w:val="en-US"/>
-        </w:rPr>
-      </w:pPr>
-      <w:r>
-        <w:rPr>
-          <w:lang w:val="en-US"/>
-        </w:rPr>
-        <w:t xml:space="preserve">The system keeps an attendance counter in Redis so that the instructor's dashboard can display the current number of students who have successfully checked in. This avoids querying PostgreSQL with </w:t>
-      </w:r>
-      <w:proofErr w:type="gramStart"/>
-      <w:r>
-        <w:rPr>
-          <w:lang w:val="en-US"/>
-        </w:rPr>
-        <w:t>COUNT(</w:t>
-      </w:r>
-      <w:proofErr w:type="gramEnd"/>
-      <w:r>
-        <w:rPr>
-          <w:lang w:val="en-US"/>
-        </w:rPr>
-        <w:t>*) every time the dashboard needs an updated number.</w:t>
-      </w:r>
-    </w:p>
-    <w:p>
-      <w:pPr>
-        <w:rPr>
-          <w:lang w:val="en-US"/>
-        </w:rPr>
-      </w:pPr>
-      <w:r>
-        <w:rPr>
-          <w:lang w:val="en-US"/>
-        </w:rPr>
-        <w:t>After a check-in is successfully processed, the system increases the counter for that event using the Redis INCR comman</w:t>
-      </w:r>
-      <w:r>
-        <w:rPr>
-          <w:lang w:val="en-US"/>
-        </w:rPr>
-        <w:t>d</w:t>
-      </w:r>
-    </w:p>
-    <w:p>
-      <w:pPr>
-        <w:rPr>
-          <w:lang w:val="en-US"/>
-        </w:rPr>
-      </w:pPr>
-      <w:r>
-        <w:rPr>
-          <w:lang w:val="en-US"/>
-        </w:rPr>
-        <w:t>The INCR operation is atomic, so multiple requests can update the same counter without interfering with each other.</w:t>
-      </w:r>
-    </w:p>
-    <w:p>
-      <w:pPr>
-        <w:rPr>
-          <w:lang w:val="en-US"/>
-        </w:rPr>
-      </w:pPr>
-      <w:r>
-        <w:rPr>
-          <w:lang w:val="en-US"/>
-        </w:rPr>
-        <w:lastRenderedPageBreak/>
-        <w:t>A background worker or notification service can read the current value and send updates to connected dashboards through Server-Sent Events (SSE).</w:t>
-      </w:r>
-    </w:p>
-    <w:p>
-      <w:pPr>
-        <w:pStyle w:val="Heading4"/>
-        <w:rPr>
-          <w:lang w:val="en-US"/>
-        </w:rPr>
-      </w:pPr>
-      <w:r>
-        <w:t>Application-Level Rate Limiting</w:t>
-      </w:r>
-    </w:p>
-    <w:p>
-      <w:pPr>
-        <w:rPr>
-          <w:lang w:val="en-US"/>
-        </w:rPr>
-      </w:pPr>
-      <w:r>
-        <w:t>Redis is also used to limit the number of check-in requests sent by each student. This works together with the rate-limiting configuration at the Nginx layer</w:t>
-      </w:r>
-      <w:r>
-        <w:rPr>
-          <w:lang w:val="en-US"/>
-        </w:rPr>
-        <w:t>.</w:t>
-      </w:r>
-    </w:p>
-    <w:p>
-      <w:pPr>
-        <w:rPr>
-          <w:i/>
-          <w:iCs/>
-          <w:lang w:val="en-US"/>
-        </w:rPr>
-      </w:pPr>
-      <w:r>
-        <w:t>The system uses a Redis Sorted Set (ZSET) to implement a sliding window. Each request is stored with its timestamp in a key with the following format</w:t>
-      </w:r>
-      <w:r>
-        <w:rPr>
-          <w:lang w:val="en-US"/>
-        </w:rPr>
-        <w:t>:</w:t>
-      </w:r>
-      <w:r>
-        <w:rPr>
-          <w:lang w:val="en-US"/>
-        </w:rPr>
-        <w:t xml:space="preserve"> </w:t>
-      </w:r>
-      <w:r>
-        <w:rPr>
-          <w:i/>
-          <w:iCs/>
+          <w:rFonts w:ascii="monospace" w:hAnsi="monospace"/>
         </w:rPr>
         <w:t>rate:limiter:{studentId}</w:t>
       </w:r>
@@ -12568,14 +12763,7 @@
                           <w:rFonts w:ascii="Cambria Math" w:hAnsi="Cambria Math"/>
                           <w:lang w:val="en-US"/>
                         </w:rPr>
-                        <m:t>Δ</m:t>
-                      </m:r>
-                      <m:r>
-                        <w:rPr>
-                          <w:rFonts w:ascii="Cambria Math" w:hAnsi="Cambria Math"/>
-                          <w:lang w:val="en-US"/>
-                        </w:rPr>
-                        <m:t>φ</m:t>
+                        <m:t>Δφ</m:t>
                       </m:r>
                     </m:num>
                     <m:den>
@@ -12964,14 +13152,7 @@
             <w:rFonts w:ascii="Cambria Math" w:hAnsi="Cambria Math"/>
             <w:lang w:val="en-US"/>
           </w:rPr>
-          <m:t>Δφ</m:t>
-        </m:r>
-        <m:r>
-          <w:rPr>
-            <w:rFonts w:ascii="Cambria Math" w:hAnsi="Cambria Math"/>
-            <w:lang w:val="en-US"/>
-          </w:rPr>
-          <m:t xml:space="preserve">= </m:t>
+          <m:t xml:space="preserve">Δφ= </m:t>
         </m:r>
         <m:sSub>
           <m:sSubPr>
@@ -13205,14 +13386,7 @@
                           <w:rFonts w:ascii="Cambria Math" w:hAnsi="Cambria Math"/>
                           <w:lang w:val="en-US"/>
                         </w:rPr>
-                        <m:t>g</m:t>
-                      </m:r>
-                      <m:r>
-                        <w:rPr>
-                          <w:rFonts w:ascii="Cambria Math" w:hAnsi="Cambria Math"/>
-                          <w:lang w:val="en-US"/>
-                        </w:rPr>
-                        <m:t>eofence</m:t>
+                        <m:t>geofence</m:t>
                       </m:r>
                     </m:sub>
                   </m:sSub>
@@ -13223,14 +13397,7 @@
                       <w:rFonts w:ascii="Cambria Math" w:hAnsi="Cambria Math"/>
                       <w:lang w:val="en-US"/>
                     </w:rPr>
-                    <m:t>0,d</m:t>
-                  </m:r>
-                  <m:r>
-                    <w:rPr>
-                      <w:rFonts w:ascii="Cambria Math" w:hAnsi="Cambria Math"/>
-                      <w:lang w:val="en-US"/>
-                    </w:rPr>
-                    <m:t>&gt;</m:t>
+                    <m:t>0,d&gt;</m:t>
                   </m:r>
                   <m:sSub>
                     <m:sSubPr>
@@ -13501,6 +13668,150 @@
     </w:p>
     <w:p>
       <w:pPr>
+        <w:rPr>
+          <w:lang w:val="en-US"/>
+        </w:rPr>
+      </w:pPr>
+      <w:r>
+        <w:rPr>
+          <w:lang w:val="en-US"/>
+        </w:rPr>
+        <w:t>In the current event attendance process at Ton Duc Thang University (TDTU), student participation is commonly recorded using barcode scanning in combination with Google Sheets. When barcode scanning cannot be performed due to technical issues, attendance may be recorded manually on paper and processed afterward. Although this approach can support basic attendance recording, it still involves several manual steps before the attendance data is reflected in the student conduct score system.</w:t>
+      </w:r>
+    </w:p>
+    <w:p>
+      <w:pPr>
+        <w:rPr>
+          <w:lang w:val="en-US"/>
+        </w:rPr>
+      </w:pPr>
+      <w:r>
+        <w:rPr>
+          <w:lang w:val="en-US"/>
+        </w:rPr>
+        <w:t xml:space="preserve">One of the main limitations is the fragmentation of attendance data across different stages of the process. Instead of being recorded directly into a centralized database during the event, attendance information may pass through several intermediate steps, such as barcode scanning </w:t>
+      </w:r>
+      <w:r>
+        <w:rPr>
+          <w:lang w:val="en-US"/>
+        </w:rPr>
+        <w:sym w:font="Symbol" w:char="F0AE"/>
+      </w:r>
+      <w:r>
+        <w:rPr>
+          <w:lang w:val="en-US"/>
+        </w:rPr>
+        <w:t xml:space="preserve"> </w:t>
+      </w:r>
+      <w:r>
+        <w:rPr>
+          <w:lang w:val="en-US"/>
+        </w:rPr>
+        <w:t xml:space="preserve">Google Sheets or paper roster </w:t>
+      </w:r>
+      <w:r>
+        <w:rPr>
+          <w:lang w:val="en-US"/>
+        </w:rPr>
+        <w:sym w:font="Symbol" w:char="F0AE"/>
+      </w:r>
+      <w:r>
+        <w:rPr>
+          <w:lang w:val="en-US"/>
+        </w:rPr>
+        <w:t xml:space="preserve"> </w:t>
+      </w:r>
+      <w:r>
+        <w:rPr>
+          <w:lang w:val="en-US"/>
+        </w:rPr>
+        <w:t xml:space="preserve">Excel filtering </w:t>
+      </w:r>
+      <w:r>
+        <w:rPr>
+          <w:lang w:val="en-US"/>
+        </w:rPr>
+        <w:sym w:font="Symbol" w:char="F0AE"/>
+      </w:r>
+      <w:r>
+        <w:rPr>
+          <w:lang w:val="en-US"/>
+        </w:rPr>
+        <w:t xml:space="preserve"> </w:t>
+      </w:r>
+      <w:r>
+        <w:rPr>
+          <w:lang w:val="en-US"/>
+        </w:rPr>
+        <w:t xml:space="preserve">email or inter-departmental transfer </w:t>
+      </w:r>
+      <w:r>
+        <w:rPr>
+          <w:lang w:val="en-US"/>
+        </w:rPr>
+        <w:sym w:font="Symbol" w:char="F0AE"/>
+      </w:r>
+      <w:r>
+        <w:rPr>
+          <w:lang w:val="en-US"/>
+        </w:rPr>
+        <w:t xml:space="preserve"> </w:t>
+      </w:r>
+      <w:r>
+        <w:rPr>
+          <w:lang w:val="en-US"/>
+        </w:rPr>
+        <w:t>data import into the Student Portal. Each additional processing step requires data to be transferred, checked, or reformatted, which increases the possibility of inconsistencies between the original attendance record and the final data stored in the system.</w:t>
+      </w:r>
+    </w:p>
+    <w:p>
+      <w:pPr>
+        <w:rPr>
+          <w:lang w:val="en-US"/>
+        </w:rPr>
+      </w:pPr>
+      <w:r>
+        <w:rPr>
+          <w:lang w:val="en-US"/>
+        </w:rPr>
+        <w:t>Another limitation is the delay between event participation and the update of conduct scores. Since attendance records still need to be collected, filtered, verified, and transferred between responsible units, students may not immediately see the corresponding results on the Student Portal. In practice, updates may take several weeks and, in some cases, may only be completed near the end of the semester. This delay makes it difficult for students to monitor their current conduct scores and identify missing or unrecorded activities in a timely manner.</w:t>
+      </w:r>
+    </w:p>
+    <w:p>
+      <w:pPr>
+        <w:rPr>
+          <w:lang w:val="en-US"/>
+        </w:rPr>
+      </w:pPr>
+      <w:r>
+        <w:rPr>
+          <w:lang w:val="en-US"/>
+        </w:rPr>
+        <w:t xml:space="preserve">Exception cases also require considerable manual handling. When a barcode cannot be scanned, a student needs a makeup check-in, or attendance is recorded using a paper roster, event organizers may have to enter or transfer Student IDs </w:t>
+      </w:r>
+      <w:r>
+        <w:rPr>
+          <w:lang w:val="en-US"/>
+        </w:rPr>
+        <w:lastRenderedPageBreak/>
+        <w:t>manually into spreadsheets. These additional steps increase the administrative workload and create opportunities for data-entry errors, such as incorrect or missing Student IDs. Resolving such errors may require further verification between students, event organizers, and the units responsible for conduct score management.</w:t>
+      </w:r>
+    </w:p>
+    <w:p>
+      <w:pPr>
+        <w:rPr>
+          <w:lang w:val="en-US"/>
+        </w:rPr>
+      </w:pPr>
+      <w:r>
+        <w:rPr>
+          <w:lang w:val="en-US"/>
+        </w:rPr>
+        <w:t>These limitations indicate that the main issue is not simply the use of barcode scanning itself, but the lack of a continuous data flow from event check-in to attendance verification and conduct score recording. Therefore, a more integrated approach is needed in which attendance data can be captured, validated, and stored directly in a centralized system, while allowing students and administrators to monitor the processing status more promptly. This provides the practical basis for developing an event attendance and conduct score management system with centralized data storage, automated validation, and near-real-time synchronization.</w:t>
+      </w:r>
+    </w:p>
+    <w:p>
+      <w:pPr>
         <w:pStyle w:val="Heading3"/>
         <w:rPr>
           <w:lang w:val="en-US"/>
@@ -13517,6 +13828,279 @@
     </w:p>
     <w:p>
       <w:pPr>
+        <w:keepNext/>
+        <w:ind w:firstLine="0"/>
+      </w:pPr>
+      <w:r>
+        <w:drawing>
+          <wp:inline distT="0" distB="0" distL="0" distR="0" wp14:anchorId="66AEA4AC" wp14:editId="3EFB5134">
+            <wp:extent cx="5579745" cy="4153535"/>
+            <wp:effectExtent l="0" t="0" r="1905" b="0"/>
+            <wp:docPr id="10" name="Picture 10"/>
+            <wp:cNvGraphicFramePr>
+              <a:graphicFrameLocks xmlns:a="http://schemas.openxmlformats.org/drawingml/2006/main" noChangeAspect="1"/>
+            </wp:cNvGraphicFramePr>
+            <a:graphic xmlns:a="http://schemas.openxmlformats.org/drawingml/2006/main">
+              <a:graphicData uri="http://schemas.openxmlformats.org/drawingml/2006/picture">
+                <pic:pic xmlns:pic="http://schemas.openxmlformats.org/drawingml/2006/picture">
+                  <pic:nvPicPr>
+                    <pic:cNvPr id="1" name=""/>
+                    <pic:cNvPicPr/>
+                  </pic:nvPicPr>
+                  <pic:blipFill>
+                    <a:blip r:embed="rId15"/>
+                    <a:stretch>
+                      <a:fillRect/>
+                    </a:stretch>
+                  </pic:blipFill>
+                  <pic:spPr>
+                    <a:xfrm>
+                      <a:off x="0" y="0"/>
+                      <a:ext cx="5579745" cy="4153535"/>
+                    </a:xfrm>
+                    <a:prstGeom prst="rect">
+                      <a:avLst/>
+                    </a:prstGeom>
+                  </pic:spPr>
+                </pic:pic>
+              </a:graphicData>
+            </a:graphic>
+          </wp:inline>
+        </w:drawing>
+      </w:r>
+    </w:p>
+    <w:p>
+      <w:pPr>
+        <w:pStyle w:val="Caption"/>
+      </w:pPr>
+      <w:r>
+        <w:t xml:space="preserve">Figure </w:t>
+      </w:r>
+      <w:r>
+        <w:fldChar w:fldCharType="begin"/>
+      </w:r>
+      <w:r>
+        <w:instrText xml:space="preserve"> STYLEREF 1 \s </w:instrText>
+      </w:r>
+      <w:r>
+        <w:fldChar w:fldCharType="separate"/>
+      </w:r>
+      <w:r>
+        <w:rPr>
+          <w:noProof/>
+        </w:rPr>
+        <w:t>3</w:t>
+      </w:r>
+      <w:r>
+        <w:fldChar w:fldCharType="end"/>
+      </w:r>
+      <w:r>
+        <w:t>.</w:t>
+      </w:r>
+      <w:r>
+        <w:fldChar w:fldCharType="begin"/>
+      </w:r>
+      <w:r>
+        <w:instrText xml:space="preserve"> SEQ Figure \* ARABIC \s 1 </w:instrText>
+      </w:r>
+      <w:r>
+        <w:fldChar w:fldCharType="separate"/>
+      </w:r>
+      <w:r>
+        <w:rPr>
+          <w:noProof/>
+        </w:rPr>
+        <w:t>1</w:t>
+      </w:r>
+      <w:r>
+        <w:fldChar w:fldCharType="end"/>
+      </w:r>
+      <w:r>
+        <w:t>Proposed Attendance Processing and Real-Time Update Process</w:t>
+      </w:r>
+    </w:p>
+    <w:p>
+      <w:pPr>
+        <w:ind w:firstLine="288"/>
+        <w:rPr>
+          <w:lang w:val="en-US"/>
+        </w:rPr>
+      </w:pPr>
+      <w:r>
+        <w:lastRenderedPageBreak/>
+        <w:t>Figure 3.</w:t>
+      </w:r>
+      <w:r>
+        <w:rPr>
+          <w:lang w:val="en-US"/>
+        </w:rPr>
+        <w:t>1</w:t>
+      </w:r>
+      <w:r>
+        <w:t xml:space="preserve"> shows the attendance processing flow from the student's check-in request to the real-time update on the instructor dashboard. The process is divided into request validation, background processing, and dashboard updates.</w:t>
+      </w:r>
+    </w:p>
+    <w:p>
+      <w:pPr>
+        <w:pStyle w:val="ListParagraph"/>
+        <w:numPr>
+          <w:ilvl w:val="0"/>
+          <w:numId w:val="16"/>
+        </w:numPr>
+        <w:rPr>
+          <w:lang w:val="en-US"/>
+        </w:rPr>
+      </w:pPr>
+      <w:r>
+        <w:rPr>
+          <w:lang w:val="en-US"/>
+        </w:rPr>
+        <w:t>Request Validation</w:t>
+      </w:r>
+    </w:p>
+    <w:p>
+      <w:pPr>
+        <w:ind w:left="270" w:firstLine="288"/>
+        <w:rPr>
+          <w:lang w:val="en-US"/>
+        </w:rPr>
+      </w:pPr>
+      <w:r>
+        <w:rPr>
+          <w:lang w:val="en-US"/>
+        </w:rPr>
+        <w:t>When a student scans the event QR code, the mobile client sends the student ID, event ID, GPS coordinates, and timestamp to the system. Nginx receives the request and forwards it to the Node.js API Server.</w:t>
+      </w:r>
+    </w:p>
+    <w:p>
+      <w:pPr>
+        <w:ind w:left="270" w:firstLine="288"/>
+        <w:rPr>
+          <w:lang w:val="en-US"/>
+        </w:rPr>
+      </w:pPr>
+      <w:r>
+        <w:rPr>
+          <w:lang w:val="en-US"/>
+        </w:rPr>
+        <w:t>The API checks Redis for duplicate requests and cached event information. It then validates the QR code, student, event, and GPS location. Valid requests are published to the RabbitMQ checkin_queue for further processing.</w:t>
+      </w:r>
+    </w:p>
+    <w:p>
+      <w:pPr>
+        <w:pStyle w:val="ListParagraph"/>
+        <w:numPr>
+          <w:ilvl w:val="0"/>
+          <w:numId w:val="16"/>
+        </w:numPr>
+        <w:rPr>
+          <w:lang w:val="en-US"/>
+        </w:rPr>
+      </w:pPr>
+      <w:r>
+        <w:rPr>
+          <w:lang w:val="en-US"/>
+        </w:rPr>
+        <w:t>Attendance Processing</w:t>
+      </w:r>
+    </w:p>
+    <w:p>
+      <w:pPr>
+        <w:ind w:left="270" w:firstLine="288"/>
+        <w:rPr>
+          <w:lang w:val="en-US"/>
+        </w:rPr>
+      </w:pPr>
+      <w:r>
+        <w:rPr>
+          <w:lang w:val="en-US"/>
+        </w:rPr>
+        <w:t>Background Workers consume messages from RabbitMQ and process the attendance data. Successful attendance records and related conduct score data are stored in PostgreSQL.</w:t>
+      </w:r>
+    </w:p>
+    <w:p>
+      <w:pPr>
+        <w:ind w:left="270" w:firstLine="288"/>
+        <w:rPr>
+          <w:lang w:val="en-US"/>
+        </w:rPr>
+      </w:pPr>
+      <w:r>
+        <w:rPr>
+          <w:lang w:val="en-US"/>
+        </w:rPr>
+        <w:t>After processing, the Worker updates the attendance counter in Redis and publishes an event to the Redis Pub/Sub channel.</w:t>
+      </w:r>
+    </w:p>
+    <w:p>
+      <w:pPr>
+        <w:pStyle w:val="ListParagraph"/>
+        <w:numPr>
+          <w:ilvl w:val="0"/>
+          <w:numId w:val="16"/>
+        </w:numPr>
+        <w:rPr>
+          <w:lang w:val="en-US"/>
+        </w:rPr>
+      </w:pPr>
+      <w:r>
+        <w:rPr>
+          <w:lang w:val="en-US"/>
+        </w:rPr>
+        <w:t>Real-Time Dashboard Update</w:t>
+      </w:r>
+    </w:p>
+    <w:p>
+      <w:pPr>
+        <w:ind w:left="450" w:firstLine="288"/>
+        <w:rPr>
+          <w:lang w:val="en-US"/>
+        </w:rPr>
+      </w:pPr>
+      <w:r>
+        <w:rPr>
+          <w:lang w:val="en-US"/>
+        </w:rPr>
+        <w:t xml:space="preserve">The SSE handler subscribes to attendance events from Redis. When a new event is received, the handler sends the updated data through </w:t>
+      </w:r>
+      <w:r>
+        <w:rPr>
+          <w:rFonts w:ascii="monospace" w:hAnsi="monospace"/>
+          <w:lang w:val="en-US"/>
+        </w:rPr>
+        <w:t>/sse/events/{eventId}</w:t>
+      </w:r>
+      <w:r>
+        <w:rPr>
+          <w:lang w:val="en-US"/>
+        </w:rPr>
+        <w:t xml:space="preserve"> to the instructor dashboard.</w:t>
+      </w:r>
+    </w:p>
+    <w:p>
+      <w:pPr>
+        <w:ind w:left="450" w:firstLine="288"/>
+        <w:rPr>
+          <w:lang w:val="en-US"/>
+        </w:rPr>
+      </w:pPr>
+      <w:r>
+        <w:rPr>
+          <w:lang w:val="en-US"/>
+        </w:rPr>
+        <w:t>The Next.js dashboard uses this data to update the attendance count and recent check-in information without reloading the page.</w:t>
+      </w:r>
+    </w:p>
+    <w:p>
+      <w:pPr>
+        <w:ind w:firstLine="0"/>
+        <w:rPr>
+          <w:lang w:val="en-US"/>
+        </w:rPr>
+      </w:pPr>
+    </w:p>
+    <w:p>
+      <w:pPr>
         <w:pStyle w:val="Heading3"/>
         <w:rPr>
           <w:lang w:val="en-US"/>
@@ -13527,9 +14111,15 @@
         <w:rPr>
           <w:lang w:val="en-US"/>
         </w:rPr>
-        <w:t>Description of Specific Business Flows</w:t>
+        <w:t xml:space="preserve">Business </w:t>
       </w:r>
       <w:bookmarkEnd w:id="43"/>
+      <w:r>
+        <w:rPr>
+          <w:lang w:val="en-US"/>
+        </w:rPr>
+        <w:t>Process</w:t>
+      </w:r>
     </w:p>
     <w:p>
       <w:pPr>
@@ -13539,76 +14129,2054 @@
         </w:rPr>
       </w:pPr>
       <w:r>
-        <w:rPr>
-          <w:lang w:val="en-US"/>
-        </w:rPr>
-        <w:t>Bi</w:t>
-      </w:r>
-      <w:r>
-        <w:rPr>
-          <w:lang w:val="en-US"/>
+        <w:t>Business Process</w:t>
+      </w:r>
+      <w:r>
+        <w:rPr>
+          <w:lang w:val="en-US"/>
+        </w:rPr>
+        <w:t xml:space="preserve"> - </w:t>
+      </w:r>
+      <w:r>
+        <w:t>Attendance</w:t>
+      </w:r>
+    </w:p>
+    <w:p>
+      <w:pPr>
+        <w:rPr>
+          <w:lang w:val="en-US"/>
+        </w:rPr>
+      </w:pPr>
+      <w:r>
+        <w:rPr>
+          <w:lang w:val="en-US"/>
+        </w:rPr>
+        <w:t>The attendance system supports both single check-in and bi-directional check-in, depending on how an event is configured.</w:t>
+      </w:r>
+    </w:p>
+    <w:p>
+      <w:pPr>
+        <w:rPr>
+          <w:lang w:val="en-US"/>
+        </w:rPr>
+      </w:pPr>
+      <w:r>
+        <w:rPr>
+          <w:lang w:val="en-US"/>
+        </w:rPr>
+        <w:lastRenderedPageBreak/>
+        <w:t>For a single check-in event, students scan once to confirm their attendance. The scan can be performed when entering the event or at the end of the event, depending on the attendance rules set by the organizer.</w:t>
+      </w:r>
+    </w:p>
+    <w:p>
+      <w:pPr>
+        <w:rPr>
+          <w:lang w:val="en-US"/>
+        </w:rPr>
+      </w:pPr>
+      <w:r>
+        <w:rPr>
+          <w:lang w:val="en-US"/>
+        </w:rPr>
+        <w:t>For a bi-directional event, students are required to scan twice. The first scan records the check-in time, while the second records the check-out time. These two records can be used to determine how long the student stayed at the event.</w:t>
+      </w:r>
+    </w:p>
+    <w:p>
+      <w:pPr>
+        <w:rPr>
+          <w:lang w:val="en-US"/>
+        </w:rPr>
+      </w:pPr>
+      <w:r>
+        <w:t>The system supports two scanning methods:</w:t>
+      </w:r>
+    </w:p>
+    <w:p>
+      <w:pPr>
+        <w:pStyle w:val="ListParagraph"/>
+        <w:numPr>
+          <w:ilvl w:val="0"/>
+          <w:numId w:val="16"/>
+        </w:numPr>
+        <w:ind w:left="270"/>
+        <w:rPr>
+          <w:lang w:val="en-US"/>
+        </w:rPr>
+      </w:pPr>
+      <w:r>
+        <w:rPr>
+          <w:lang w:val="en-US"/>
+        </w:rPr>
+        <w:t xml:space="preserve">Student scans event QR: The organizer displays an event QR code and students scan it using their mobile devices. </w:t>
+      </w:r>
+    </w:p>
+    <w:p>
+      <w:pPr>
+        <w:pStyle w:val="ListParagraph"/>
+        <w:numPr>
+          <w:ilvl w:val="0"/>
+          <w:numId w:val="16"/>
+        </w:numPr>
+        <w:ind w:left="270"/>
+        <w:rPr>
+          <w:lang w:val="en-US"/>
+        </w:rPr>
+      </w:pPr>
+      <w:r>
+        <w:rPr>
+          <w:lang w:val="en-US"/>
+        </w:rPr>
+        <w:t>Organizer scans student code: The student presents a personal QR code or barcode, which is scanned by the organizer at the attendance point.</w:t>
+      </w:r>
+    </w:p>
+    <w:p>
+      <w:pPr>
+        <w:rPr>
+          <w:lang w:val="en-US"/>
+        </w:rPr>
+      </w:pPr>
+      <w:r>
+        <w:t>Both methods use the same processing flow. A scan request is sent through Nginx to the Node.js API Server. The API checks duplicate requests through Redis and validates the attendance conditions, including the configured GPS area when required. Valid requests are sent to RabbitMQ and processed by background Workers. Attendance records are stored in PostgreSQL, while Redis Pub/Sub and SSE are used to send attendance updates to the monitoring dashboard.</w:t>
+      </w:r>
+    </w:p>
+    <w:p>
+      <w:pPr>
+        <w:pStyle w:val="Heading4"/>
+        <w:rPr>
+          <w:lang w:val="en-US"/>
+        </w:rPr>
+      </w:pPr>
+      <w:r>
+        <w:t>Business Process</w:t>
+      </w:r>
+      <w:r>
+        <w:rPr>
+          <w:lang w:val="en-US"/>
+        </w:rPr>
+        <w:t xml:space="preserve"> - </w:t>
+      </w:r>
+      <w:r>
+        <w:rPr>
+          <w:lang w:val="en-US"/>
+        </w:rPr>
+        <w:t>Smart Advisor</w:t>
+      </w:r>
+    </w:p>
+    <w:p>
+      <w:pPr>
+        <w:rPr>
+          <w:lang w:val="en-US"/>
+        </w:rPr>
+      </w:pPr>
+      <w:r>
+        <w:rPr>
+          <w:lang w:val="en-US"/>
+        </w:rPr>
+        <w:t>The Smart Advisor helps students find events based on their available time and current conduct score progress.</w:t>
+      </w:r>
+    </w:p>
+    <w:p>
+      <w:pPr>
+        <w:rPr>
+          <w:lang w:val="en-US"/>
+        </w:rPr>
+      </w:pPr>
+      <w:r>
+        <w:rPr>
+          <w:lang w:val="en-US"/>
+        </w:rPr>
+        <w:t>For event recommendations, the system compares upcoming event schedules with the student's timetable. Events that overlap with scheduled classes are excluded, and the remaining events can be suggested to the student.</w:t>
+      </w:r>
+    </w:p>
+    <w:p>
+      <w:pPr>
+        <w:rPr>
+          <w:lang w:val="en-US"/>
+        </w:rPr>
+      </w:pPr>
+      <w:r>
+        <w:rPr>
+          <w:lang w:val="en-US"/>
+        </w:rPr>
+        <w:t>The system also checks the student's conduct score near the end of the semester. When there are 30 days or less remaining, it identifies score categories that have not reached their required targets. The system then searches for ongoing or upcoming events related to those categories.</w:t>
+      </w:r>
+    </w:p>
+    <w:p>
+      <w:pPr>
+        <w:rPr>
+          <w:lang w:val="en-US"/>
+        </w:rPr>
+      </w:pPr>
+      <w:r>
+        <w:rPr>
+          <w:lang w:val="en-US"/>
+        </w:rPr>
+        <w:lastRenderedPageBreak/>
+        <w:t>If suitable events are available, the student receives a notification containing the relevant event information. The student can review the suggestions and decide whether to register or participate.</w:t>
+      </w:r>
+    </w:p>
+    <w:p>
+      <w:pPr>
+        <w:pStyle w:val="Heading4"/>
+        <w:rPr>
+          <w:lang w:val="en-US"/>
+        </w:rPr>
+      </w:pPr>
+      <w:r>
+        <w:t>Business Process</w:t>
+      </w:r>
+      <w:r>
+        <w:rPr>
+          <w:lang w:val="en-US"/>
+        </w:rPr>
+        <w:t xml:space="preserve"> - </w:t>
+      </w:r>
+      <w:r>
+        <w:rPr>
+          <w:lang w:val="en-US"/>
+        </w:rPr>
+        <w:t>Verification &amp; Evidence</w:t>
+      </w:r>
+    </w:p>
+    <w:p>
+      <w:pPr>
+        <w:rPr>
+          <w:lang w:val="en-US"/>
+        </w:rPr>
+      </w:pPr>
+      <w:r>
+        <w:rPr>
+          <w:lang w:val="en-US"/>
+        </w:rPr>
+        <w:t>The verification flow handles attendance appeals and cases where the normal check-in process cannot be completed.</w:t>
+      </w:r>
+    </w:p>
+    <w:p>
+      <w:pPr>
+        <w:rPr>
+          <w:lang w:val="en-US"/>
+        </w:rPr>
+      </w:pPr>
+      <w:r>
+        <w:rPr>
+          <w:lang w:val="en-US"/>
+        </w:rPr>
+        <w:t>During normal operation, each successful check-in or check-out is stored with information such as the student, event, recorded time, attendance type, and GPS coordinates when location checking is enabled. This information can later be used to review an attendance result.</w:t>
+      </w:r>
+    </w:p>
+    <w:p>
+      <w:pPr>
+        <w:rPr>
+          <w:lang w:val="en-US"/>
+        </w:rPr>
+      </w:pPr>
+      <w:r>
+        <w:rPr>
+          <w:lang w:val="en-US"/>
+        </w:rPr>
+        <w:t>If the attendance service is temporarily unavailable, the client keeps the attendance request locally instead of immediately treating the attempt as failed. The locally stored data includes the student ID, event ID, scan time, attendance type, and available location information. When the connection is restored, the client can submit the pending request to the server for verification.</w:t>
+      </w:r>
+    </w:p>
+    <w:p>
+      <w:pPr>
+        <w:rPr>
+          <w:lang w:val="en-US"/>
+        </w:rPr>
+      </w:pPr>
+      <w:r>
+        <w:rPr>
+          <w:lang w:val="en-US"/>
+        </w:rPr>
+        <w:t xml:space="preserve">Changes made by an administrator are recorded with the administrator, modification time, previous result, new result, and reason for the change. This keeps the original attendance information </w:t>
+      </w:r>
+      <w:proofErr w:type="gramStart"/>
+      <w:r>
+        <w:rPr>
+          <w:lang w:val="en-US"/>
+        </w:rPr>
+        <w:t>separate</w:t>
+      </w:r>
+      <w:proofErr w:type="gramEnd"/>
+      <w:r>
+        <w:rPr>
+          <w:lang w:val="en-US"/>
+        </w:rPr>
+        <w:t xml:space="preserve"> from later administrative adjustments.</w:t>
+      </w:r>
+    </w:p>
+    <w:p>
+      <w:pPr>
+        <w:pStyle w:val="Heading2"/>
+        <w:rPr>
+          <w:iCs/>
+          <w:lang w:val="en-US"/>
+        </w:rPr>
+      </w:pPr>
+      <w:bookmarkStart w:id="44" w:name="_Toc238200782"/>
+      <w:r>
+        <w:rPr>
+          <w:iCs/>
+        </w:rPr>
+        <w:t>Functional Requirements</w:t>
+      </w:r>
+      <w:bookmarkEnd w:id="44"/>
+    </w:p>
+    <w:p>
+      <w:pPr>
+        <w:rPr>
+          <w:lang w:val="en-US"/>
+        </w:rPr>
+      </w:pPr>
+      <w:r>
+        <w:t>This section describes the functional requirements of the attendance and event management system. It identifies the system actors and presents the Use Case diagrams for the main system and its sub-systems. The specifications of the main Use Cases are also provided.</w:t>
+      </w:r>
+    </w:p>
+    <w:p>
+      <w:pPr>
+        <w:ind w:firstLine="0"/>
+        <w:rPr>
+          <w:lang w:val="en-US"/>
+        </w:rPr>
+      </w:pPr>
+      <w:r>
+        <w:rPr>
+          <w:lang w:val="en-US"/>
+        </w:rPr>
+        <w:br w:type="page"/>
+      </w:r>
+    </w:p>
+    <w:p>
+      <w:pPr>
+        <w:pStyle w:val="Heading3"/>
+        <w:rPr>
+          <w:lang w:val="en-US"/>
+        </w:rPr>
+      </w:pPr>
+      <w:bookmarkStart w:id="45" w:name="_Toc238200783"/>
+      <w:r>
+        <w:lastRenderedPageBreak/>
+        <w:t>Actor Identification</w:t>
+      </w:r>
+      <w:bookmarkEnd w:id="45"/>
+    </w:p>
+    <w:p>
+      <w:pPr>
+        <w:rPr>
+          <w:lang w:val="en-US"/>
+        </w:rPr>
+      </w:pPr>
+      <w:r>
+        <w:t xml:space="preserve">The system involves </w:t>
+      </w:r>
+      <w:r>
+        <w:rPr>
+          <w:lang w:val="en-US"/>
+        </w:rPr>
+        <w:t xml:space="preserve">four </w:t>
+      </w:r>
+      <w:r>
+        <w:t xml:space="preserve"> main actors:</w:t>
+      </w:r>
+    </w:p>
+    <w:p>
+      <w:pPr>
+        <w:pStyle w:val="Caption"/>
+        <w:keepNext/>
+      </w:pPr>
+      <w:r>
+        <w:t xml:space="preserve">Table </w:t>
+      </w:r>
+      <w:r>
+        <w:fldChar w:fldCharType="begin"/>
+      </w:r>
+      <w:r>
+        <w:instrText xml:space="preserve"> STYLEREF 1 \s </w:instrText>
+      </w:r>
+      <w:r>
+        <w:fldChar w:fldCharType="separate"/>
+      </w:r>
+      <w:r>
+        <w:rPr>
+          <w:noProof/>
+        </w:rPr>
+        <w:t>3</w:t>
+      </w:r>
+      <w:r>
+        <w:fldChar w:fldCharType="end"/>
+      </w:r>
+      <w:r>
+        <w:t>.</w:t>
+      </w:r>
+      <w:r>
+        <w:fldChar w:fldCharType="begin"/>
+      </w:r>
+      <w:r>
+        <w:instrText xml:space="preserve"> SEQ Table \* ARABIC \s 1 </w:instrText>
+      </w:r>
+      <w:r>
+        <w:fldChar w:fldCharType="separate"/>
+      </w:r>
+      <w:r>
+        <w:rPr>
+          <w:noProof/>
+        </w:rPr>
+        <w:t>1</w:t>
+      </w:r>
+      <w:r>
+        <w:fldChar w:fldCharType="end"/>
+      </w:r>
+      <w:r>
+        <w:rPr>
+          <w:lang w:val="en-US"/>
+        </w:rPr>
+        <w:t xml:space="preserve">Actor </w:t>
+      </w:r>
+      <w:r>
+        <w:t>Description</w:t>
+      </w:r>
+    </w:p>
+    <w:tbl>
+      <w:tblPr>
+        <w:tblStyle w:val="TableGrid"/>
+        <w:tblW w:w="9072" w:type="dxa"/>
+        <w:tblLook w:val="04A0" w:firstRow="1" w:lastRow="0" w:firstColumn="1" w:lastColumn="0" w:noHBand="0" w:noVBand="1"/>
+      </w:tblPr>
+      <w:tblGrid>
+        <w:gridCol w:w="1098"/>
+        <w:gridCol w:w="1334"/>
+        <w:gridCol w:w="6640"/>
+      </w:tblGrid>
+      <w:tr>
+        <w:trPr>
+          <w:trHeight w:val="20"/>
+        </w:trPr>
+        <w:tc>
+          <w:tcPr>
+            <w:tcW w:w="1098" w:type="dxa"/>
+            <w:shd w:val="clear" w:color="auto" w:fill="8EAADB" w:themeFill="accent1" w:themeFillTint="99"/>
+            <w:vAlign w:val="center"/>
+          </w:tcPr>
+          <w:p>
+            <w:pPr>
+              <w:spacing w:before="240" w:after="240"/>
+              <w:ind w:firstLine="0"/>
+              <w:jc w:val="center"/>
+              <w:rPr>
+                <w:b/>
+                <w:bCs/>
+                <w:lang w:val="en-US"/>
+              </w:rPr>
+            </w:pPr>
+            <w:r>
+              <w:rPr>
+                <w:b/>
+                <w:bCs/>
+                <w:lang w:val="en-US"/>
+              </w:rPr>
+              <w:t>Code</w:t>
+            </w:r>
+          </w:p>
+        </w:tc>
+        <w:tc>
+          <w:tcPr>
+            <w:tcW w:w="1334" w:type="dxa"/>
+            <w:shd w:val="clear" w:color="auto" w:fill="8EAADB" w:themeFill="accent1" w:themeFillTint="99"/>
+            <w:vAlign w:val="center"/>
+          </w:tcPr>
+          <w:p>
+            <w:pPr>
+              <w:spacing w:before="240" w:after="240"/>
+              <w:ind w:firstLine="0"/>
+              <w:jc w:val="center"/>
+              <w:rPr>
+                <w:b/>
+                <w:bCs/>
+                <w:lang w:val="en-US"/>
+              </w:rPr>
+            </w:pPr>
+            <w:r>
+              <w:rPr>
+                <w:b/>
+                <w:bCs/>
+                <w:lang w:val="en-US"/>
+              </w:rPr>
+              <w:t>Name</w:t>
+            </w:r>
+          </w:p>
+        </w:tc>
+        <w:tc>
+          <w:tcPr>
+            <w:tcW w:w="6640" w:type="dxa"/>
+            <w:shd w:val="clear" w:color="auto" w:fill="8EAADB" w:themeFill="accent1" w:themeFillTint="99"/>
+            <w:vAlign w:val="center"/>
+          </w:tcPr>
+          <w:p>
+            <w:pPr>
+              <w:spacing w:before="240" w:after="240"/>
+              <w:ind w:firstLine="0"/>
+              <w:jc w:val="center"/>
+              <w:rPr>
+                <w:b/>
+                <w:bCs/>
+              </w:rPr>
+            </w:pPr>
+            <w:r>
+              <w:rPr>
+                <w:b/>
+                <w:bCs/>
+              </w:rPr>
+              <w:t>Description</w:t>
+            </w:r>
+          </w:p>
+        </w:tc>
+      </w:tr>
+      <w:tr>
+        <w:trPr>
+          <w:trHeight w:val="864"/>
+        </w:trPr>
+        <w:tc>
+          <w:tcPr>
+            <w:tcW w:w="1098" w:type="dxa"/>
+            <w:vAlign w:val="center"/>
+          </w:tcPr>
+          <w:p>
+            <w:pPr>
+              <w:spacing w:line="360" w:lineRule="auto"/>
+              <w:ind w:firstLine="0"/>
+              <w:jc w:val="center"/>
+            </w:pPr>
+            <w:r>
+              <w:t>ACT-0</w:t>
+            </w:r>
+            <w:r>
+              <w:rPr>
+                <w:lang w:val="en-US"/>
+              </w:rPr>
+              <w:t>1</w:t>
+            </w:r>
+          </w:p>
+        </w:tc>
+        <w:tc>
+          <w:tcPr>
+            <w:tcW w:w="1334" w:type="dxa"/>
+            <w:vAlign w:val="center"/>
+          </w:tcPr>
+          <w:p>
+            <w:pPr>
+              <w:spacing w:line="360" w:lineRule="auto"/>
+              <w:ind w:firstLine="0"/>
+              <w:jc w:val="center"/>
+            </w:pPr>
+            <w:r>
+              <w:t>Admin</w:t>
+            </w:r>
+          </w:p>
+        </w:tc>
+        <w:tc>
+          <w:tcPr>
+            <w:tcW w:w="6640" w:type="dxa"/>
+            <w:vAlign w:val="center"/>
+          </w:tcPr>
+          <w:p>
+            <w:pPr>
+              <w:spacing w:line="360" w:lineRule="auto"/>
+              <w:ind w:firstLine="0"/>
+            </w:pPr>
+            <w:r>
+              <w:t>Manages system settings, user accounts, roles, and permissions.</w:t>
+            </w:r>
+          </w:p>
+        </w:tc>
+      </w:tr>
+      <w:tr>
+        <w:trPr>
+          <w:trHeight w:val="864"/>
+        </w:trPr>
+        <w:tc>
+          <w:tcPr>
+            <w:tcW w:w="1098" w:type="dxa"/>
+            <w:vAlign w:val="center"/>
+          </w:tcPr>
+          <w:p>
+            <w:pPr>
+              <w:spacing w:line="360" w:lineRule="auto"/>
+              <w:ind w:firstLine="0"/>
+              <w:jc w:val="center"/>
+            </w:pPr>
+            <w:r>
+              <w:t>ACT-0</w:t>
+            </w:r>
+            <w:r>
+              <w:rPr>
+                <w:lang w:val="en-US"/>
+              </w:rPr>
+              <w:t>2</w:t>
+            </w:r>
+          </w:p>
+        </w:tc>
+        <w:tc>
+          <w:tcPr>
+            <w:tcW w:w="1334" w:type="dxa"/>
+            <w:vAlign w:val="center"/>
+          </w:tcPr>
+          <w:p>
+            <w:pPr>
+              <w:spacing w:line="360" w:lineRule="auto"/>
+              <w:ind w:firstLine="0"/>
+              <w:jc w:val="center"/>
+              <w:rPr>
+                <w:lang w:val="en-US"/>
+              </w:rPr>
+            </w:pPr>
+            <w:r>
+              <w:t xml:space="preserve">Faculty </w:t>
+            </w:r>
+            <w:r>
+              <w:t>Student Affairs</w:t>
+            </w:r>
+          </w:p>
+          <w:p>
+            <w:pPr>
+              <w:spacing w:line="360" w:lineRule="auto"/>
+              <w:ind w:firstLine="0"/>
+              <w:jc w:val="center"/>
+            </w:pPr>
+            <w:r>
+              <w:t>Officer</w:t>
+            </w:r>
+          </w:p>
+        </w:tc>
+        <w:tc>
+          <w:tcPr>
+            <w:tcW w:w="6640" w:type="dxa"/>
+            <w:vAlign w:val="center"/>
+          </w:tcPr>
+          <w:p>
+            <w:pPr>
+              <w:spacing w:line="360" w:lineRule="auto"/>
+              <w:ind w:firstLine="0"/>
+            </w:pPr>
+            <w:r>
+              <w:t>Manages conduct score activities within the Faculty, manages Event Organizers, monitors student scores, and handles attendance or score disputes</w:t>
+            </w:r>
+          </w:p>
+        </w:tc>
+      </w:tr>
+      <w:tr>
+        <w:trPr>
+          <w:trHeight w:val="864"/>
+        </w:trPr>
+        <w:tc>
+          <w:tcPr>
+            <w:tcW w:w="1098" w:type="dxa"/>
+            <w:vAlign w:val="center"/>
+          </w:tcPr>
+          <w:p>
+            <w:pPr>
+              <w:spacing w:line="360" w:lineRule="auto"/>
+              <w:ind w:firstLine="0"/>
+              <w:jc w:val="center"/>
+              <w:rPr>
+                <w:lang w:val="en-US"/>
+              </w:rPr>
+            </w:pPr>
+            <w:r>
+              <w:t>ACT-0</w:t>
+            </w:r>
+            <w:r>
+              <w:rPr>
+                <w:lang w:val="en-US"/>
+              </w:rPr>
+              <w:t>3</w:t>
+            </w:r>
+          </w:p>
+        </w:tc>
+        <w:tc>
+          <w:tcPr>
+            <w:tcW w:w="1334" w:type="dxa"/>
+            <w:vAlign w:val="center"/>
+          </w:tcPr>
+          <w:p>
+            <w:pPr>
+              <w:spacing w:line="360" w:lineRule="auto"/>
+              <w:ind w:firstLine="0"/>
+              <w:jc w:val="center"/>
+            </w:pPr>
+            <w:r>
+              <w:t>Event Organizer</w:t>
+            </w:r>
+          </w:p>
+        </w:tc>
+        <w:tc>
+          <w:tcPr>
+            <w:tcW w:w="6640" w:type="dxa"/>
+            <w:vAlign w:val="center"/>
+          </w:tcPr>
+          <w:p>
+            <w:pPr>
+              <w:spacing w:line="360" w:lineRule="auto"/>
+              <w:ind w:firstLine="0"/>
+            </w:pPr>
+            <w:r>
+              <w:t>Creates and manages events, performs attendance operations, monitors check-in results, and reviews student attendance appeals.</w:t>
+            </w:r>
+          </w:p>
+        </w:tc>
+      </w:tr>
+      <w:tr>
+        <w:trPr>
+          <w:trHeight w:val="864"/>
+        </w:trPr>
+        <w:tc>
+          <w:tcPr>
+            <w:tcW w:w="1098" w:type="dxa"/>
+            <w:vAlign w:val="center"/>
+          </w:tcPr>
+          <w:p>
+            <w:pPr>
+              <w:spacing w:line="360" w:lineRule="auto"/>
+              <w:ind w:firstLine="0"/>
+              <w:jc w:val="center"/>
+              <w:rPr>
+                <w:lang w:val="en-US"/>
+              </w:rPr>
+            </w:pPr>
+            <w:r>
+              <w:t>ACT-0</w:t>
+            </w:r>
+            <w:r>
+              <w:rPr>
+                <w:lang w:val="en-US"/>
+              </w:rPr>
+              <w:t>4</w:t>
+            </w:r>
+          </w:p>
+        </w:tc>
+        <w:tc>
+          <w:tcPr>
+            <w:tcW w:w="1334" w:type="dxa"/>
+            <w:vAlign w:val="center"/>
+          </w:tcPr>
+          <w:p>
+            <w:pPr>
+              <w:spacing w:line="360" w:lineRule="auto"/>
+              <w:ind w:firstLine="0"/>
+              <w:jc w:val="center"/>
+            </w:pPr>
+            <w:r>
+              <w:t>Student</w:t>
+            </w:r>
+          </w:p>
+        </w:tc>
+        <w:tc>
+          <w:tcPr>
+            <w:tcW w:w="6640" w:type="dxa"/>
+            <w:vAlign w:val="center"/>
+          </w:tcPr>
+          <w:p>
+            <w:pPr>
+              <w:spacing w:line="360" w:lineRule="auto"/>
+              <w:ind w:firstLine="0"/>
+            </w:pPr>
+            <w:r>
+              <w:t>Participates in events, performs check-in/check-out, tracks conduct scores, receives event recommendations and reminders, and submits attendance appeals.</w:t>
+            </w:r>
+          </w:p>
+        </w:tc>
+      </w:tr>
+    </w:tbl>
+    <w:p>
+      <w:pPr>
+        <w:ind w:firstLine="0"/>
+        <w:rPr>
+          <w:lang w:val="en-US"/>
+        </w:rPr>
+      </w:pPr>
+    </w:p>
+    <w:p>
+      <w:pPr>
+        <w:pStyle w:val="Heading3"/>
+        <w:rPr>
+          <w:lang w:val="en-US"/>
+        </w:rPr>
+      </w:pPr>
+      <w:bookmarkStart w:id="46" w:name="_Toc238200784"/>
+      <w:r>
+        <w:lastRenderedPageBreak/>
+        <w:t>Use Case Diagram</w:t>
+      </w:r>
+      <w:bookmarkEnd w:id="46"/>
+    </w:p>
+    <w:p>
+      <w:pPr>
+        <w:keepNext/>
+        <w:spacing w:before="240"/>
+        <w:ind w:firstLine="0"/>
+      </w:pPr>
+      <w:r>
+        <w:rPr>
+          <w:noProof/>
+          <w:lang w:val="en-US"/>
+        </w:rPr>
+        <w:drawing>
+          <wp:inline distT="0" distB="0" distL="0" distR="0" wp14:anchorId="72817737" wp14:editId="42775384">
+            <wp:extent cx="5579745" cy="6139180"/>
+            <wp:effectExtent l="0" t="0" r="1905" b="0"/>
+            <wp:docPr id="7" name="Picture 7"/>
+            <wp:cNvGraphicFramePr>
+              <a:graphicFrameLocks xmlns:a="http://schemas.openxmlformats.org/drawingml/2006/main" noChangeAspect="1"/>
+            </wp:cNvGraphicFramePr>
+            <a:graphic xmlns:a="http://schemas.openxmlformats.org/drawingml/2006/main">
+              <a:graphicData uri="http://schemas.openxmlformats.org/drawingml/2006/picture">
+                <pic:pic xmlns:pic="http://schemas.openxmlformats.org/drawingml/2006/picture">
+                  <pic:nvPicPr>
+                    <pic:cNvPr id="7" name="Picture 7"/>
+                    <pic:cNvPicPr/>
+                  </pic:nvPicPr>
+                  <pic:blipFill>
+                    <a:blip r:embed="rId16" cstate="print">
+                      <a:extLst>
+                        <a:ext uri="{28A0092B-C50C-407E-A947-70E740481C1C}">
+                          <a14:useLocalDpi xmlns:a14="http://schemas.microsoft.com/office/drawing/2010/main" val="0"/>
+                        </a:ext>
+                      </a:extLst>
+                    </a:blip>
+                    <a:stretch>
+                      <a:fillRect/>
+                    </a:stretch>
+                  </pic:blipFill>
+                  <pic:spPr>
+                    <a:xfrm>
+                      <a:off x="0" y="0"/>
+                      <a:ext cx="5579745" cy="6139180"/>
+                    </a:xfrm>
+                    <a:prstGeom prst="rect">
+                      <a:avLst/>
+                    </a:prstGeom>
+                  </pic:spPr>
+                </pic:pic>
+              </a:graphicData>
+            </a:graphic>
+          </wp:inline>
+        </w:drawing>
+      </w:r>
+    </w:p>
+    <w:p>
+      <w:pPr>
+        <w:pStyle w:val="Caption"/>
+        <w:rPr>
+          <w:lang w:val="en-US"/>
+        </w:rPr>
+      </w:pPr>
+      <w:r>
+        <w:t xml:space="preserve">Figure </w:t>
+      </w:r>
+      <w:r>
+        <w:fldChar w:fldCharType="begin"/>
+      </w:r>
+      <w:r>
+        <w:instrText xml:space="preserve"> STYLEREF 1 \s </w:instrText>
+      </w:r>
+      <w:r>
+        <w:fldChar w:fldCharType="separate"/>
+      </w:r>
+      <w:r>
+        <w:rPr>
+          <w:noProof/>
+        </w:rPr>
+        <w:t>3</w:t>
+      </w:r>
+      <w:r>
+        <w:fldChar w:fldCharType="end"/>
+      </w:r>
+      <w:r>
+        <w:t>.</w:t>
+      </w:r>
+      <w:r>
+        <w:fldChar w:fldCharType="begin"/>
+      </w:r>
+      <w:r>
+        <w:instrText xml:space="preserve"> SEQ Figure \* ARABIC \s 1 </w:instrText>
+      </w:r>
+      <w:r>
+        <w:fldChar w:fldCharType="separate"/>
+      </w:r>
+      <w:r>
+        <w:rPr>
+          <w:noProof/>
+        </w:rPr>
+        <w:t>2</w:t>
+      </w:r>
+      <w:r>
+        <w:fldChar w:fldCharType="end"/>
+      </w:r>
+      <w:r>
+        <w:rPr>
+          <w:lang w:val="en-US"/>
+        </w:rPr>
+        <w:t>Overall Use Case Diagram</w:t>
+      </w:r>
+    </w:p>
+    <w:p>
+      <w:pPr>
+        <w:ind w:firstLine="0"/>
+        <w:rPr>
+          <w:lang w:val="en-US"/>
+        </w:rPr>
+      </w:pPr>
+      <w:r>
+        <w:rPr>
+          <w:lang w:val="en-US"/>
+        </w:rPr>
+        <w:br w:type="page"/>
+      </w:r>
+    </w:p>
+    <w:p>
+      <w:pPr>
+        <w:pStyle w:val="Caption"/>
+        <w:keepNext/>
+      </w:pPr>
+      <w:r>
+        <w:lastRenderedPageBreak/>
+        <w:t xml:space="preserve">Table </w:t>
+      </w:r>
+      <w:r>
+        <w:fldChar w:fldCharType="begin"/>
+      </w:r>
+      <w:r>
+        <w:instrText xml:space="preserve"> STYLEREF 1 \s </w:instrText>
+      </w:r>
+      <w:r>
+        <w:fldChar w:fldCharType="separate"/>
+      </w:r>
+      <w:r>
+        <w:rPr>
+          <w:noProof/>
+        </w:rPr>
+        <w:t>3</w:t>
+      </w:r>
+      <w:r>
+        <w:fldChar w:fldCharType="end"/>
+      </w:r>
+      <w:r>
+        <w:t>.</w:t>
+      </w:r>
+      <w:r>
+        <w:fldChar w:fldCharType="begin"/>
+      </w:r>
+      <w:r>
+        <w:instrText xml:space="preserve"> SEQ Table \* ARABIC \s 1 </w:instrText>
+      </w:r>
+      <w:r>
+        <w:fldChar w:fldCharType="separate"/>
+      </w:r>
+      <w:r>
+        <w:rPr>
+          <w:noProof/>
+        </w:rPr>
+        <w:t>2</w:t>
+      </w:r>
+      <w:r>
+        <w:fldChar w:fldCharType="end"/>
+      </w:r>
+      <w:r>
+        <w:rPr>
+          <w:lang w:val="en-US"/>
+        </w:rPr>
+        <w:t xml:space="preserve"> </w:t>
+      </w:r>
+      <w:r>
+        <w:rPr>
+          <w:lang w:val="en-US"/>
+        </w:rPr>
+        <w:t>Summary of System Use Cases</w:t>
+      </w:r>
+    </w:p>
+    <w:tbl>
+      <w:tblPr>
+        <w:tblStyle w:val="TableGrid"/>
+        <w:tblW w:w="0" w:type="auto"/>
+        <w:tblLook w:val="04A0" w:firstRow="1" w:lastRow="0" w:firstColumn="1" w:lastColumn="0" w:noHBand="0" w:noVBand="1"/>
+      </w:tblPr>
+      <w:tblGrid>
+        <w:gridCol w:w="1099"/>
+        <w:gridCol w:w="2926"/>
+        <w:gridCol w:w="4978"/>
+      </w:tblGrid>
+      <w:tr>
+        <w:tc>
+          <w:tcPr>
+            <w:tcW w:w="1099" w:type="dxa"/>
+            <w:shd w:val="clear" w:color="auto" w:fill="8EAADB" w:themeFill="accent1" w:themeFillTint="99"/>
+          </w:tcPr>
+          <w:p>
+            <w:pPr>
+              <w:spacing w:before="240" w:after="240"/>
+              <w:ind w:firstLine="0"/>
+              <w:jc w:val="center"/>
+              <w:rPr>
+                <w:lang w:val="en-US"/>
+              </w:rPr>
+            </w:pPr>
+            <w:r>
+              <w:rPr>
+                <w:b/>
+                <w:bCs/>
+                <w:lang w:val="en-US"/>
+              </w:rPr>
+              <w:t>Code</w:t>
+            </w:r>
+          </w:p>
+        </w:tc>
+        <w:tc>
+          <w:tcPr>
+            <w:tcW w:w="2926" w:type="dxa"/>
+            <w:shd w:val="clear" w:color="auto" w:fill="8EAADB" w:themeFill="accent1" w:themeFillTint="99"/>
+          </w:tcPr>
+          <w:p>
+            <w:pPr>
+              <w:spacing w:before="240" w:after="240"/>
+              <w:ind w:firstLine="0"/>
+              <w:jc w:val="center"/>
+              <w:rPr>
+                <w:b/>
+                <w:bCs/>
+                <w:lang w:val="en-US"/>
+              </w:rPr>
+            </w:pPr>
+            <w:r>
+              <w:rPr>
+                <w:b/>
+                <w:bCs/>
+                <w:lang w:val="en-US"/>
+              </w:rPr>
+              <w:t>Use Case</w:t>
+            </w:r>
+          </w:p>
+        </w:tc>
+        <w:tc>
+          <w:tcPr>
+            <w:tcW w:w="4978" w:type="dxa"/>
+            <w:shd w:val="clear" w:color="auto" w:fill="8EAADB" w:themeFill="accent1" w:themeFillTint="99"/>
+          </w:tcPr>
+          <w:p>
+            <w:pPr>
+              <w:spacing w:before="240" w:after="240"/>
+              <w:ind w:firstLine="0"/>
+              <w:jc w:val="center"/>
+              <w:rPr>
+                <w:lang w:val="en-US"/>
+              </w:rPr>
+            </w:pPr>
+            <w:r>
+              <w:rPr>
+                <w:b/>
+                <w:bCs/>
+              </w:rPr>
+              <w:t>Description</w:t>
+            </w:r>
+          </w:p>
+        </w:tc>
+      </w:tr>
+      <w:tr>
+        <w:tc>
+          <w:tcPr>
+            <w:tcW w:w="1099" w:type="dxa"/>
+            <w:vAlign w:val="center"/>
+          </w:tcPr>
+          <w:p>
+            <w:pPr>
+              <w:spacing w:before="240"/>
+              <w:ind w:firstLine="0"/>
+              <w:jc w:val="center"/>
+              <w:rPr>
+                <w:lang w:val="en-US"/>
+              </w:rPr>
+            </w:pPr>
+            <w:r>
+              <w:rPr>
+                <w:lang w:val="en-US"/>
+              </w:rPr>
+              <w:t>UC1</w:t>
+            </w:r>
+          </w:p>
+        </w:tc>
+        <w:tc>
+          <w:tcPr>
+            <w:tcW w:w="2926" w:type="dxa"/>
+            <w:vAlign w:val="center"/>
+          </w:tcPr>
+          <w:p>
+            <w:pPr>
+              <w:spacing w:before="240"/>
+              <w:ind w:firstLine="0"/>
+              <w:jc w:val="center"/>
+              <w:rPr>
+                <w:lang w:val="en-US"/>
+              </w:rPr>
+            </w:pPr>
+            <w:r>
+              <w:rPr>
+                <w:lang w:val="en-US"/>
+              </w:rPr>
+              <w:t>Submit Appeal</w:t>
+            </w:r>
+          </w:p>
+        </w:tc>
+        <w:tc>
+          <w:tcPr>
+            <w:tcW w:w="4978" w:type="dxa"/>
+          </w:tcPr>
+          <w:p>
+            <w:pPr>
+              <w:spacing w:before="240" w:line="360" w:lineRule="auto"/>
+              <w:ind w:firstLine="0"/>
+              <w:rPr>
+                <w:lang w:val="en-US"/>
+              </w:rPr>
+            </w:pPr>
+            <w:r>
+              <w:t>Allows students to submit appeals related to attendance or conduct scores.</w:t>
+            </w:r>
+          </w:p>
+        </w:tc>
+      </w:tr>
+      <w:tr>
+        <w:tc>
+          <w:tcPr>
+            <w:tcW w:w="1099" w:type="dxa"/>
+            <w:vAlign w:val="center"/>
+          </w:tcPr>
+          <w:p>
+            <w:pPr>
+              <w:spacing w:before="240"/>
+              <w:ind w:firstLine="0"/>
+              <w:jc w:val="center"/>
+              <w:rPr>
+                <w:lang w:val="en-US"/>
+              </w:rPr>
+            </w:pPr>
+            <w:r>
+              <w:rPr>
+                <w:lang w:val="en-US"/>
+              </w:rPr>
+              <w:t>UC2</w:t>
+            </w:r>
+          </w:p>
+        </w:tc>
+        <w:tc>
+          <w:tcPr>
+            <w:tcW w:w="2926" w:type="dxa"/>
+            <w:vAlign w:val="center"/>
+          </w:tcPr>
+          <w:p>
+            <w:pPr>
+              <w:spacing w:before="240"/>
+              <w:ind w:firstLine="0"/>
+              <w:jc w:val="center"/>
+              <w:rPr>
+                <w:lang w:val="en-US"/>
+              </w:rPr>
+            </w:pPr>
+            <w:r>
+              <w:t>Track Conduct Score</w:t>
+            </w:r>
+          </w:p>
+        </w:tc>
+        <w:tc>
+          <w:tcPr>
+            <w:tcW w:w="4978" w:type="dxa"/>
+          </w:tcPr>
+          <w:p>
+            <w:pPr>
+              <w:spacing w:before="240" w:line="360" w:lineRule="auto"/>
+              <w:ind w:firstLine="0"/>
+              <w:rPr>
+                <w:lang w:val="en-US"/>
+              </w:rPr>
+            </w:pPr>
+            <w:r>
+              <w:t>Allows students to monitor their conduct scores and score change history.</w:t>
+            </w:r>
+          </w:p>
+        </w:tc>
+      </w:tr>
+      <w:tr>
+        <w:tc>
+          <w:tcPr>
+            <w:tcW w:w="1099" w:type="dxa"/>
+            <w:vAlign w:val="center"/>
+          </w:tcPr>
+          <w:p>
+            <w:pPr>
+              <w:spacing w:before="240"/>
+              <w:ind w:firstLine="0"/>
+              <w:jc w:val="center"/>
+              <w:rPr>
+                <w:lang w:val="en-US"/>
+              </w:rPr>
+            </w:pPr>
+            <w:r>
+              <w:rPr>
+                <w:lang w:val="en-US"/>
+              </w:rPr>
+              <w:t>UC3</w:t>
+            </w:r>
+          </w:p>
+        </w:tc>
+        <w:tc>
+          <w:tcPr>
+            <w:tcW w:w="2926" w:type="dxa"/>
+            <w:vAlign w:val="center"/>
+          </w:tcPr>
+          <w:p>
+            <w:pPr>
+              <w:spacing w:before="240"/>
+              <w:ind w:firstLine="0"/>
+              <w:jc w:val="center"/>
+              <w:rPr>
+                <w:lang w:val="en-US"/>
+              </w:rPr>
+            </w:pPr>
+            <w:r>
+              <w:rPr>
+                <w:lang w:val="en-US"/>
+              </w:rPr>
+              <w:t>Check In to Event</w:t>
+            </w:r>
+          </w:p>
+        </w:tc>
+        <w:tc>
+          <w:tcPr>
+            <w:tcW w:w="4978" w:type="dxa"/>
+          </w:tcPr>
+          <w:p>
+            <w:pPr>
+              <w:spacing w:before="240" w:line="360" w:lineRule="auto"/>
+              <w:ind w:firstLine="0"/>
+              <w:rPr>
+                <w:lang w:val="en-US"/>
+              </w:rPr>
+            </w:pPr>
+            <w:r>
+              <w:t>Allows students to check in when participating in an event.</w:t>
+            </w:r>
+          </w:p>
+        </w:tc>
+      </w:tr>
+      <w:tr>
+        <w:tc>
+          <w:tcPr>
+            <w:tcW w:w="1099" w:type="dxa"/>
+            <w:vAlign w:val="center"/>
+          </w:tcPr>
+          <w:p>
+            <w:pPr>
+              <w:spacing w:before="240"/>
+              <w:ind w:firstLine="0"/>
+              <w:jc w:val="center"/>
+              <w:rPr>
+                <w:lang w:val="en-US"/>
+              </w:rPr>
+            </w:pPr>
+            <w:r>
+              <w:rPr>
+                <w:lang w:val="en-US"/>
+              </w:rPr>
+              <w:t>UC4</w:t>
+            </w:r>
+          </w:p>
+        </w:tc>
+        <w:tc>
+          <w:tcPr>
+            <w:tcW w:w="2926" w:type="dxa"/>
+            <w:vAlign w:val="center"/>
+          </w:tcPr>
+          <w:p>
+            <w:pPr>
+              <w:spacing w:before="240"/>
+              <w:ind w:firstLine="0"/>
+              <w:jc w:val="center"/>
+              <w:rPr>
+                <w:lang w:val="en-US"/>
+              </w:rPr>
+            </w:pPr>
+            <w:r>
+              <w:t>View Recommended Events</w:t>
+            </w:r>
+          </w:p>
+        </w:tc>
+        <w:tc>
+          <w:tcPr>
+            <w:tcW w:w="4978" w:type="dxa"/>
+          </w:tcPr>
+          <w:p>
+            <w:pPr>
+              <w:spacing w:before="240" w:line="360" w:lineRule="auto"/>
+              <w:ind w:firstLine="0"/>
+              <w:rPr>
+                <w:lang w:val="en-US"/>
+              </w:rPr>
+            </w:pPr>
+            <w:r>
+              <w:t>Allows students to view events recommended by the system.</w:t>
+            </w:r>
+          </w:p>
+        </w:tc>
+      </w:tr>
+      <w:tr>
+        <w:tc>
+          <w:tcPr>
+            <w:tcW w:w="1099" w:type="dxa"/>
+            <w:vAlign w:val="center"/>
+          </w:tcPr>
+          <w:p>
+            <w:pPr>
+              <w:spacing w:before="240"/>
+              <w:ind w:firstLine="0"/>
+              <w:jc w:val="center"/>
+              <w:rPr>
+                <w:lang w:val="en-US"/>
+              </w:rPr>
+            </w:pPr>
+            <w:r>
+              <w:rPr>
+                <w:lang w:val="en-US"/>
+              </w:rPr>
+              <w:t>UC5</w:t>
+            </w:r>
+          </w:p>
+        </w:tc>
+        <w:tc>
+          <w:tcPr>
+            <w:tcW w:w="2926" w:type="dxa"/>
+            <w:vAlign w:val="center"/>
+          </w:tcPr>
+          <w:p>
+            <w:pPr>
+              <w:spacing w:before="240"/>
+              <w:ind w:firstLine="0"/>
+              <w:jc w:val="center"/>
+              <w:rPr>
+                <w:lang w:val="en-US"/>
+              </w:rPr>
+            </w:pPr>
+            <w:r>
+              <w:rPr>
+                <w:lang w:val="en-US"/>
+              </w:rPr>
+              <w:t>View</w:t>
+            </w:r>
+            <w:r>
+              <w:rPr>
+                <w:lang w:val="en-US"/>
+              </w:rPr>
+              <w:t xml:space="preserve"> </w:t>
+            </w:r>
+            <w:r>
+              <w:rPr>
+                <w:lang w:val="en-US"/>
+              </w:rPr>
+              <w:t>Reminder</w:t>
+            </w:r>
+          </w:p>
+        </w:tc>
+        <w:tc>
+          <w:tcPr>
+            <w:tcW w:w="4978" w:type="dxa"/>
+          </w:tcPr>
+          <w:p>
+            <w:pPr>
+              <w:spacing w:before="240" w:line="360" w:lineRule="auto"/>
+              <w:ind w:firstLine="0"/>
+              <w:rPr>
+                <w:lang w:val="en-US"/>
+              </w:rPr>
+            </w:pPr>
+            <w:r>
+              <w:t>Allows students to view notifications and reminders related to events or conduct scores.</w:t>
+            </w:r>
+          </w:p>
+        </w:tc>
+      </w:tr>
+      <w:tr>
+        <w:tc>
+          <w:tcPr>
+            <w:tcW w:w="1099" w:type="dxa"/>
+            <w:vAlign w:val="center"/>
+          </w:tcPr>
+          <w:p>
+            <w:pPr>
+              <w:spacing w:before="240"/>
+              <w:ind w:firstLine="0"/>
+              <w:jc w:val="center"/>
+              <w:rPr>
+                <w:lang w:val="en-US"/>
+              </w:rPr>
+            </w:pPr>
+            <w:r>
+              <w:rPr>
+                <w:lang w:val="en-US"/>
+              </w:rPr>
+              <w:t>UC6</w:t>
+            </w:r>
+          </w:p>
+        </w:tc>
+        <w:tc>
+          <w:tcPr>
+            <w:tcW w:w="2926" w:type="dxa"/>
+            <w:vAlign w:val="center"/>
+          </w:tcPr>
+          <w:p>
+            <w:pPr>
+              <w:spacing w:before="240"/>
+              <w:ind w:firstLine="0"/>
+              <w:jc w:val="center"/>
+              <w:rPr>
+                <w:lang w:val="en-US"/>
+              </w:rPr>
+            </w:pPr>
+            <w:r>
+              <w:rPr>
+                <w:lang w:val="en-US"/>
+              </w:rPr>
+              <w:t>Manage Events</w:t>
+            </w:r>
+          </w:p>
+        </w:tc>
+        <w:tc>
+          <w:tcPr>
+            <w:tcW w:w="4978" w:type="dxa"/>
+          </w:tcPr>
+          <w:p>
+            <w:pPr>
+              <w:spacing w:before="240" w:line="360" w:lineRule="auto"/>
+              <w:ind w:firstLine="0"/>
+              <w:rPr>
+                <w:lang w:val="en-US"/>
+              </w:rPr>
+            </w:pPr>
+            <w:r>
+              <w:t>Allows Event Organizers to create, view, update, and delete events.</w:t>
+            </w:r>
+          </w:p>
+        </w:tc>
+      </w:tr>
+      <w:tr>
+        <w:tc>
+          <w:tcPr>
+            <w:tcW w:w="1099" w:type="dxa"/>
+            <w:vAlign w:val="center"/>
+          </w:tcPr>
+          <w:p>
+            <w:pPr>
+              <w:spacing w:before="240"/>
+              <w:ind w:firstLine="0"/>
+              <w:jc w:val="center"/>
+              <w:rPr>
+                <w:lang w:val="en-US"/>
+              </w:rPr>
+            </w:pPr>
+            <w:r>
+              <w:rPr>
+                <w:lang w:val="en-US"/>
+              </w:rPr>
+              <w:t>UC7</w:t>
+            </w:r>
+          </w:p>
+        </w:tc>
+        <w:tc>
+          <w:tcPr>
+            <w:tcW w:w="2926" w:type="dxa"/>
+            <w:vAlign w:val="center"/>
+          </w:tcPr>
+          <w:p>
+            <w:pPr>
+              <w:spacing w:before="240"/>
+              <w:ind w:firstLine="0"/>
+              <w:jc w:val="center"/>
+              <w:rPr>
+                <w:lang w:val="en-US"/>
+              </w:rPr>
+            </w:pPr>
+            <w:r>
+              <w:rPr>
+                <w:lang w:val="en-US"/>
+              </w:rPr>
+              <w:t>Monitor Attendance</w:t>
+            </w:r>
+          </w:p>
+        </w:tc>
+        <w:tc>
+          <w:tcPr>
+            <w:tcW w:w="4978" w:type="dxa"/>
+          </w:tcPr>
+          <w:p>
+            <w:pPr>
+              <w:spacing w:before="240" w:line="360" w:lineRule="auto"/>
+              <w:ind w:firstLine="0"/>
+              <w:rPr>
+                <w:lang w:val="en-US"/>
+              </w:rPr>
+            </w:pPr>
+            <w:r>
+              <w:t>Allows Event Organizers to monitor students’ attendance status and attendance lists for an event.</w:t>
+            </w:r>
+          </w:p>
+        </w:tc>
+      </w:tr>
+      <w:tr>
+        <w:tc>
+          <w:tcPr>
+            <w:tcW w:w="1099" w:type="dxa"/>
+            <w:vAlign w:val="center"/>
+          </w:tcPr>
+          <w:p>
+            <w:pPr>
+              <w:spacing w:before="240"/>
+              <w:ind w:firstLine="0"/>
+              <w:jc w:val="center"/>
+              <w:rPr>
+                <w:lang w:val="en-US"/>
+              </w:rPr>
+            </w:pPr>
+            <w:r>
+              <w:rPr>
+                <w:lang w:val="en-US"/>
+              </w:rPr>
+              <w:t>UC8</w:t>
+            </w:r>
+          </w:p>
+        </w:tc>
+        <w:tc>
+          <w:tcPr>
+            <w:tcW w:w="2926" w:type="dxa"/>
+            <w:vAlign w:val="center"/>
+          </w:tcPr>
+          <w:p>
+            <w:pPr>
+              <w:spacing w:before="240"/>
+              <w:ind w:firstLine="0"/>
+              <w:jc w:val="center"/>
+              <w:rPr>
+                <w:lang w:val="en-US"/>
+              </w:rPr>
+            </w:pPr>
+            <w:r>
+              <w:rPr>
+                <w:lang w:val="en-US"/>
+              </w:rPr>
+              <w:t>Handle Appeal</w:t>
+            </w:r>
+          </w:p>
+        </w:tc>
+        <w:tc>
+          <w:tcPr>
+            <w:tcW w:w="4978" w:type="dxa"/>
+          </w:tcPr>
+          <w:p>
+            <w:pPr>
+              <w:spacing w:before="240" w:line="360" w:lineRule="auto"/>
+              <w:ind w:firstLine="0"/>
+              <w:rPr>
+                <w:lang w:val="en-US"/>
+              </w:rPr>
+            </w:pPr>
+            <w:r>
+              <w:t>Allows Faculty Student Affairs Officers to review and process student appeals.</w:t>
+            </w:r>
+          </w:p>
+        </w:tc>
+      </w:tr>
+      <w:tr>
+        <w:tc>
+          <w:tcPr>
+            <w:tcW w:w="1099" w:type="dxa"/>
+            <w:vAlign w:val="center"/>
+          </w:tcPr>
+          <w:p>
+            <w:pPr>
+              <w:spacing w:before="240"/>
+              <w:ind w:firstLine="0"/>
+              <w:jc w:val="center"/>
+              <w:rPr>
+                <w:lang w:val="en-US"/>
+              </w:rPr>
+            </w:pPr>
+            <w:r>
+              <w:rPr>
+                <w:lang w:val="en-US"/>
+              </w:rPr>
+              <w:t>UC9</w:t>
+            </w:r>
+          </w:p>
+        </w:tc>
+        <w:tc>
+          <w:tcPr>
+            <w:tcW w:w="2926" w:type="dxa"/>
+            <w:vAlign w:val="center"/>
+          </w:tcPr>
+          <w:p>
+            <w:pPr>
+              <w:spacing w:before="240"/>
+              <w:ind w:firstLine="0"/>
+              <w:jc w:val="center"/>
+              <w:rPr>
+                <w:lang w:val="en-US"/>
+              </w:rPr>
+            </w:pPr>
+            <w:r>
+              <w:t>Manage Event Organizers</w:t>
+            </w:r>
+          </w:p>
+        </w:tc>
+        <w:tc>
+          <w:tcPr>
+            <w:tcW w:w="4978" w:type="dxa"/>
+          </w:tcPr>
+          <w:p>
+            <w:pPr>
+              <w:spacing w:before="240" w:line="360" w:lineRule="auto"/>
+              <w:ind w:firstLine="0"/>
+              <w:rPr>
+                <w:lang w:val="en-US"/>
+              </w:rPr>
+            </w:pPr>
+            <w:r>
+              <w:t>Allows Faculty Student Affairs Officers to create, view, update, and delete Event Organizer information.</w:t>
+            </w:r>
+          </w:p>
+        </w:tc>
+      </w:tr>
+    </w:tbl>
+    <w:p>
+      <w:pPr>
+        <w:ind w:firstLine="0"/>
+        <w:rPr>
+          <w:lang w:val="en-US"/>
+        </w:rPr>
+      </w:pPr>
+    </w:p>
+    <w:tbl>
+      <w:tblPr>
+        <w:tblStyle w:val="TableGrid"/>
+        <w:tblW w:w="0" w:type="auto"/>
+        <w:tblLook w:val="04A0" w:firstRow="1" w:lastRow="0" w:firstColumn="1" w:lastColumn="0" w:noHBand="0" w:noVBand="1"/>
+      </w:tblPr>
+      <w:tblGrid>
+        <w:gridCol w:w="1099"/>
+        <w:gridCol w:w="2926"/>
+        <w:gridCol w:w="4978"/>
+      </w:tblGrid>
+      <w:tr>
+        <w:tc>
+          <w:tcPr>
+            <w:tcW w:w="1099" w:type="dxa"/>
+            <w:vAlign w:val="center"/>
+          </w:tcPr>
+          <w:p>
+            <w:pPr>
+              <w:spacing w:before="240"/>
+              <w:ind w:firstLine="0"/>
+              <w:jc w:val="center"/>
+              <w:rPr>
+                <w:lang w:val="en-US"/>
+              </w:rPr>
+            </w:pPr>
+            <w:r>
+              <w:rPr>
+                <w:lang w:val="en-US"/>
+              </w:rPr>
+              <w:lastRenderedPageBreak/>
+              <w:t>UC10</w:t>
+            </w:r>
+          </w:p>
+        </w:tc>
+        <w:tc>
+          <w:tcPr>
+            <w:tcW w:w="2926" w:type="dxa"/>
+            <w:vAlign w:val="center"/>
+          </w:tcPr>
+          <w:p>
+            <w:pPr>
+              <w:spacing w:before="240"/>
+              <w:ind w:firstLine="0"/>
+              <w:jc w:val="center"/>
+              <w:rPr>
+                <w:lang w:val="en-US"/>
+              </w:rPr>
+            </w:pPr>
+            <w:r>
+              <w:t>Manage conduct scores</w:t>
+            </w:r>
+          </w:p>
+        </w:tc>
+        <w:tc>
+          <w:tcPr>
+            <w:tcW w:w="4978" w:type="dxa"/>
+          </w:tcPr>
+          <w:p>
+            <w:pPr>
+              <w:spacing w:before="240" w:line="360" w:lineRule="auto"/>
+              <w:ind w:firstLine="0"/>
+              <w:rPr>
+                <w:lang w:val="en-US"/>
+              </w:rPr>
+            </w:pPr>
+            <w:r>
+              <w:t>Allows Faculty Student Affairs Officers to create, view, update, and delete student conduct score records.</w:t>
+            </w:r>
+          </w:p>
+        </w:tc>
+      </w:tr>
+      <w:tr>
+        <w:tc>
+          <w:tcPr>
+            <w:tcW w:w="1099" w:type="dxa"/>
+            <w:vAlign w:val="center"/>
+          </w:tcPr>
+          <w:p>
+            <w:pPr>
+              <w:spacing w:before="240"/>
+              <w:ind w:firstLine="0"/>
+              <w:jc w:val="center"/>
+              <w:rPr>
+                <w:lang w:val="en-US"/>
+              </w:rPr>
+            </w:pPr>
+            <w:r>
+              <w:rPr>
+                <w:lang w:val="en-US"/>
+              </w:rPr>
+              <w:t>UC11</w:t>
+            </w:r>
+          </w:p>
+        </w:tc>
+        <w:tc>
+          <w:tcPr>
+            <w:tcW w:w="2926" w:type="dxa"/>
+            <w:vAlign w:val="center"/>
+          </w:tcPr>
+          <w:p>
+            <w:pPr>
+              <w:spacing w:before="240"/>
+              <w:ind w:firstLine="0"/>
+              <w:jc w:val="center"/>
+              <w:rPr>
+                <w:lang w:val="en-US"/>
+              </w:rPr>
+            </w:pPr>
+            <w:r>
+              <w:rPr>
+                <w:lang w:val="en-US"/>
+              </w:rPr>
+              <w:t>Manage system settings</w:t>
+            </w:r>
+          </w:p>
+        </w:tc>
+        <w:tc>
+          <w:tcPr>
+            <w:tcW w:w="4978" w:type="dxa"/>
+          </w:tcPr>
+          <w:p>
+            <w:pPr>
+              <w:spacing w:before="240" w:line="360" w:lineRule="auto"/>
+              <w:ind w:firstLine="0"/>
+              <w:rPr>
+                <w:lang w:val="en-US"/>
+              </w:rPr>
+            </w:pPr>
+            <w:r>
+              <w:t>Allows Admins to create, view, update, and delete system configuration settings.</w:t>
+            </w:r>
+          </w:p>
+        </w:tc>
+      </w:tr>
+      <w:tr>
+        <w:tc>
+          <w:tcPr>
+            <w:tcW w:w="1099" w:type="dxa"/>
+            <w:vAlign w:val="center"/>
+          </w:tcPr>
+          <w:p>
+            <w:pPr>
+              <w:spacing w:before="240"/>
+              <w:ind w:firstLine="0"/>
+              <w:jc w:val="center"/>
+              <w:rPr>
+                <w:lang w:val="en-US"/>
+              </w:rPr>
+            </w:pPr>
+            <w:r>
+              <w:rPr>
+                <w:lang w:val="en-US"/>
+              </w:rPr>
+              <w:t>UC12</w:t>
+            </w:r>
+          </w:p>
+        </w:tc>
+        <w:tc>
+          <w:tcPr>
+            <w:tcW w:w="2926" w:type="dxa"/>
+            <w:vAlign w:val="center"/>
+          </w:tcPr>
+          <w:p>
+            <w:pPr>
+              <w:spacing w:before="240"/>
+              <w:ind w:firstLine="0"/>
+              <w:jc w:val="center"/>
+              <w:rPr>
+                <w:lang w:val="en-US"/>
+              </w:rPr>
+            </w:pPr>
+            <w:r>
+              <w:rPr>
+                <w:lang w:val="en-US"/>
+              </w:rPr>
+              <w:t>Manage user accounts</w:t>
+            </w:r>
+          </w:p>
+        </w:tc>
+        <w:tc>
+          <w:tcPr>
+            <w:tcW w:w="4978" w:type="dxa"/>
+          </w:tcPr>
+          <w:p>
+            <w:pPr>
+              <w:tabs>
+                <w:tab w:val="left" w:pos="1305"/>
+              </w:tabs>
+              <w:spacing w:before="240" w:line="360" w:lineRule="auto"/>
+              <w:ind w:firstLine="0"/>
+              <w:rPr>
+                <w:lang w:val="en-US"/>
+              </w:rPr>
+            </w:pPr>
+            <w:r>
+              <w:t>Allows Admins to create, view, update, and delete user accounts.</w:t>
+            </w:r>
+          </w:p>
+        </w:tc>
+      </w:tr>
+      <w:tr>
+        <w:tc>
+          <w:tcPr>
+            <w:tcW w:w="1099" w:type="dxa"/>
+            <w:vAlign w:val="center"/>
+          </w:tcPr>
+          <w:p>
+            <w:pPr>
+              <w:spacing w:before="240"/>
+              <w:ind w:firstLine="0"/>
+              <w:jc w:val="center"/>
+              <w:rPr>
+                <w:lang w:val="en-US"/>
+              </w:rPr>
+            </w:pPr>
+            <w:r>
+              <w:rPr>
+                <w:lang w:val="en-US"/>
+              </w:rPr>
+              <w:t>UC13</w:t>
+            </w:r>
+          </w:p>
+        </w:tc>
+        <w:tc>
+          <w:tcPr>
+            <w:tcW w:w="2926" w:type="dxa"/>
+            <w:vAlign w:val="center"/>
+          </w:tcPr>
+          <w:p>
+            <w:pPr>
+              <w:spacing w:before="240"/>
+              <w:ind w:firstLine="0"/>
+              <w:jc w:val="center"/>
+              <w:rPr>
+                <w:lang w:val="en-US"/>
+              </w:rPr>
+            </w:pPr>
+            <w:r>
+              <w:rPr>
+                <w:lang w:val="en-US"/>
+              </w:rPr>
+              <w:t>Manage roles</w:t>
+            </w:r>
+          </w:p>
+        </w:tc>
+        <w:tc>
+          <w:tcPr>
+            <w:tcW w:w="4978" w:type="dxa"/>
+          </w:tcPr>
+          <w:p>
+            <w:pPr>
+              <w:spacing w:before="240" w:line="360" w:lineRule="auto"/>
+              <w:ind w:firstLine="0"/>
+              <w:rPr>
+                <w:lang w:val="en-US"/>
+              </w:rPr>
+            </w:pPr>
+            <w:r>
+              <w:t>Allows Admins to create, view, update, and delete roles and their associated permissions.</w:t>
+            </w:r>
+          </w:p>
+        </w:tc>
+      </w:tr>
+    </w:tbl>
+    <w:p>
+      <w:pPr>
+        <w:pStyle w:val="Heading3"/>
+        <w:rPr>
+          <w:lang w:val="en-US" w:eastAsia="zh-TW"/>
+        </w:rPr>
+      </w:pPr>
+      <w:bookmarkStart w:id="47" w:name="_Toc238200786"/>
+      <w:r>
+        <w:rPr>
+          <w:lang w:eastAsia="zh-TW"/>
+        </w:rPr>
+        <w:t>Use Case Specifications</w:t>
+      </w:r>
+      <w:bookmarkEnd w:id="47"/>
+    </w:p>
+    <w:p>
+      <w:pPr>
+        <w:pStyle w:val="Heading4"/>
+        <w:rPr>
+          <w:lang w:val="en-US"/>
+        </w:rPr>
+      </w:pPr>
+      <w:r>
+        <w:t>Use Case</w:t>
+      </w:r>
+      <w:r>
+        <w:t xml:space="preserve"> </w:t>
+      </w:r>
+      <w:r>
+        <w:rPr>
+          <w:lang w:val="en-US"/>
+        </w:rPr>
+        <w:t xml:space="preserve">- </w:t>
+      </w:r>
+      <w:r>
+        <w:t>Check In to Event</w:t>
+      </w:r>
+    </w:p>
+    <w:p>
+      <w:pPr>
+        <w:rPr>
+          <w:lang w:val="en-US"/>
+        </w:rPr>
+      </w:pPr>
+    </w:p>
+    <w:p>
+      <w:pPr>
+        <w:pStyle w:val="Heading4"/>
+      </w:pPr>
+      <w:r>
+        <w:rPr>
+          <w:lang w:val="en-US"/>
+        </w:rPr>
+        <w:t xml:space="preserve">Use Case - </w:t>
+      </w:r>
+      <w:r>
+        <w:t>Manage Conduct Scores</w:t>
+      </w:r>
+    </w:p>
+    <w:p>
+      <w:pPr>
+        <w:pStyle w:val="Heading4"/>
+      </w:pPr>
+      <w:r>
+        <w:rPr>
+          <w:lang w:val="en-US"/>
+        </w:rPr>
+        <w:t xml:space="preserve">Use Case - </w:t>
+      </w:r>
+      <w:r>
+        <w:t xml:space="preserve">Submit Appeal </w:t>
+      </w:r>
+      <w:r>
+        <w:rPr>
+          <w:lang w:val="en-US"/>
+        </w:rPr>
+        <w:t>&amp;</w:t>
+      </w:r>
+      <w:r>
+        <w:t xml:space="preserve"> Handle Appeal</w:t>
+      </w:r>
+    </w:p>
+    <w:p>
+      <w:pPr>
+        <w:pStyle w:val="Heading2"/>
+        <w:rPr>
+          <w:lang w:val="en-US" w:eastAsia="zh-TW"/>
+        </w:rPr>
+      </w:pPr>
+      <w:bookmarkStart w:id="48" w:name="_Toc238200787"/>
+      <w:r>
+        <w:rPr>
+          <w:lang w:eastAsia="zh-TW"/>
+        </w:rPr>
+        <w:t>Non</w:t>
+      </w:r>
+      <w:r>
+        <w:rPr>
+          <w:lang w:eastAsia="zh-TW"/>
         </w:rPr>
         <w:t>-</w:t>
       </w:r>
       <w:r>
         <w:rPr>
-          <w:lang w:val="en-US"/>
-        </w:rPr>
-        <w:t>directional Check</w:t>
-      </w:r>
-      <w:r>
-        <w:rPr>
-          <w:lang w:val="en-US"/>
-        </w:rPr>
+          <w:lang w:eastAsia="zh-TW"/>
+        </w:rPr>
+        <w:t>Functional Requirements</w:t>
+      </w:r>
+      <w:bookmarkEnd w:id="48"/>
+    </w:p>
+    <w:p>
+      <w:pPr>
+        <w:pStyle w:val="Heading3"/>
+        <w:rPr>
+          <w:lang w:val="en-US"/>
+        </w:rPr>
+      </w:pPr>
+      <w:bookmarkStart w:id="49" w:name="_Toc238200788"/>
+      <w:r>
+        <w:t>Performance &amp; Concurrency</w:t>
+      </w:r>
+      <w:bookmarkEnd w:id="49"/>
+    </w:p>
+    <w:p>
+      <w:pPr>
+        <w:pStyle w:val="Heading3"/>
+        <w:rPr>
+          <w:lang w:val="en-US"/>
+        </w:rPr>
+      </w:pPr>
+      <w:bookmarkStart w:id="50" w:name="_Toc238200789"/>
+      <w:r>
+        <w:t>High Availability &amp; Scalability</w:t>
+      </w:r>
+      <w:bookmarkEnd w:id="50"/>
+    </w:p>
+    <w:p>
+      <w:pPr>
+        <w:pStyle w:val="Heading3"/>
+        <w:rPr>
+          <w:lang w:val="en-US"/>
+        </w:rPr>
+      </w:pPr>
+      <w:bookmarkStart w:id="51" w:name="_Toc238200790"/>
+      <w:r>
+        <w:t>Security &amp; Anti</w:t>
+      </w:r>
+      <w:r>
         <w:t>-</w:t>
       </w:r>
       <w:r>
-        <w:rPr>
-          <w:lang w:val="en-US"/>
-        </w:rPr>
-        <w:t>in Flow</w:t>
-      </w:r>
-    </w:p>
-    <w:p>
-      <w:pPr>
-        <w:pStyle w:val="Heading4"/>
-        <w:rPr>
-          <w:lang w:val="en-US"/>
-        </w:rPr>
-      </w:pPr>
-      <w:r>
-        <w:rPr>
-          <w:lang w:val="en-US"/>
-        </w:rPr>
-        <w:t>Smart Advisor Flow</w:t>
-      </w:r>
-    </w:p>
-    <w:p>
-      <w:pPr>
-        <w:pStyle w:val="Heading4"/>
-        <w:rPr>
-          <w:lang w:val="en-US"/>
-        </w:rPr>
-      </w:pPr>
-      <w:r>
-        <w:rPr>
-          <w:lang w:val="en-US"/>
-        </w:rPr>
-        <w:t>Verification &amp; Evidence Flow</w:t>
-      </w:r>
-    </w:p>
-    <w:p>
-      <w:pPr>
-        <w:pStyle w:val="Heading2"/>
-        <w:rPr>
-          <w:lang w:val="en-US"/>
-        </w:rPr>
-      </w:pPr>
-      <w:bookmarkStart w:id="44" w:name="_Toc238200782"/>
-      <w:r>
-        <w:t>Functional Requirements</w:t>
-      </w:r>
-      <w:bookmarkEnd w:id="44"/>
+        <w:t>Fraud</w:t>
+      </w:r>
+      <w:bookmarkEnd w:id="51"/>
     </w:p>
     <w:p>
       <w:pPr>
@@ -13617,195 +16185,11 @@
           <w:lang w:val="en-US"/>
         </w:rPr>
       </w:pPr>
-      <w:bookmarkStart w:id="45" w:name="_Toc238200783"/>
-      <w:r>
-        <w:t>Actor Identification</w:t>
-      </w:r>
-      <w:bookmarkEnd w:id="45"/>
-    </w:p>
-    <w:p>
-      <w:pPr>
-        <w:pStyle w:val="Heading3"/>
-        <w:rPr>
-          <w:lang w:val="en-US"/>
-        </w:rPr>
-      </w:pPr>
-      <w:bookmarkStart w:id="46" w:name="_Toc238200784"/>
-      <w:r>
-        <w:t>Overall Use Case Diagram</w:t>
-      </w:r>
-      <w:bookmarkEnd w:id="46"/>
-    </w:p>
-    <w:p>
-      <w:pPr>
-        <w:pStyle w:val="Heading3"/>
-        <w:rPr>
-          <w:lang w:val="en-US"/>
-        </w:rPr>
-      </w:pPr>
-      <w:bookmarkStart w:id="47" w:name="_Toc238200785"/>
-      <w:r>
-        <w:t>Detailed Use Case Diagram</w:t>
-      </w:r>
-      <w:bookmarkEnd w:id="47"/>
-    </w:p>
-    <w:p>
-      <w:pPr>
-        <w:pStyle w:val="Heading4"/>
-        <w:rPr>
-          <w:lang w:val="en-US" w:eastAsia="zh-TW"/>
-        </w:rPr>
-      </w:pPr>
-      <w:r>
-        <w:rPr>
-          <w:lang w:val="en-US" w:eastAsia="zh-TW"/>
-        </w:rPr>
-        <w:t>Attendance &amp; Authentication Module</w:t>
-      </w:r>
-    </w:p>
-    <w:p>
-      <w:pPr>
-        <w:pStyle w:val="Heading4"/>
-        <w:rPr>
-          <w:lang w:val="en-US" w:eastAsia="zh-TW"/>
-        </w:rPr>
-      </w:pPr>
-      <w:r>
-        <w:rPr>
-          <w:lang w:val="en-US" w:eastAsia="zh-TW"/>
-        </w:rPr>
-        <w:t>Smart Advisor Module</w:t>
-      </w:r>
-    </w:p>
-    <w:p>
-      <w:pPr>
-        <w:pStyle w:val="Heading4"/>
-        <w:rPr>
-          <w:lang w:val="en-US" w:eastAsia="zh-TW"/>
-        </w:rPr>
-      </w:pPr>
-      <w:r>
-        <w:rPr>
-          <w:lang w:val="en-US" w:eastAsia="zh-TW"/>
-        </w:rPr>
-        <w:t>Event Management Module</w:t>
-      </w:r>
-    </w:p>
-    <w:p>
-      <w:pPr>
-        <w:pStyle w:val="Heading4"/>
-        <w:rPr>
-          <w:lang w:val="en-US" w:eastAsia="zh-TW"/>
-        </w:rPr>
-      </w:pPr>
-      <w:r>
-        <w:rPr>
-          <w:lang w:val="en-US" w:eastAsia="zh-TW"/>
-        </w:rPr>
-        <w:t>Appeals &amp; Complaints Handling Module</w:t>
-      </w:r>
-    </w:p>
-    <w:p>
-      <w:pPr>
-        <w:pStyle w:val="Heading3"/>
-        <w:rPr>
-          <w:lang w:val="en-US" w:eastAsia="zh-TW"/>
-        </w:rPr>
-      </w:pPr>
-      <w:bookmarkStart w:id="48" w:name="_Toc238200786"/>
-      <w:r>
-        <w:rPr>
-          <w:lang w:eastAsia="zh-TW"/>
-        </w:rPr>
-        <w:t>Use Case Specifications</w:t>
-      </w:r>
-      <w:bookmarkEnd w:id="48"/>
-    </w:p>
-    <w:p>
-      <w:pPr>
-        <w:pStyle w:val="Heading2"/>
-        <w:rPr>
-          <w:lang w:val="en-US" w:eastAsia="zh-TW"/>
-        </w:rPr>
-      </w:pPr>
-      <w:bookmarkStart w:id="49" w:name="_Toc238200787"/>
-      <w:r>
-        <w:rPr>
-          <w:lang w:eastAsia="zh-TW"/>
-        </w:rPr>
-        <w:t>Non</w:t>
-      </w:r>
-      <w:r>
-        <w:rPr>
-          <w:lang w:eastAsia="zh-TW"/>
-        </w:rPr>
-        <w:t>-</w:t>
-      </w:r>
-      <w:r>
-        <w:rPr>
-          <w:lang w:eastAsia="zh-TW"/>
-        </w:rPr>
-        <w:t>Functional Requirements</w:t>
-      </w:r>
-      <w:bookmarkEnd w:id="49"/>
-    </w:p>
-    <w:p>
-      <w:pPr>
-        <w:pStyle w:val="Heading3"/>
-        <w:rPr>
-          <w:lang w:val="en-US"/>
-        </w:rPr>
-      </w:pPr>
-      <w:bookmarkStart w:id="50" w:name="_Toc238200788"/>
-      <w:r>
-        <w:t>Performance &amp; Concurrency</w:t>
-      </w:r>
-      <w:bookmarkEnd w:id="50"/>
-    </w:p>
-    <w:p>
-      <w:pPr>
-        <w:pStyle w:val="Heading3"/>
-        <w:rPr>
-          <w:lang w:val="en-US"/>
-        </w:rPr>
-      </w:pPr>
-      <w:bookmarkStart w:id="51" w:name="_Toc238200789"/>
-      <w:r>
-        <w:t>High Availability &amp; Scalability</w:t>
-      </w:r>
-      <w:bookmarkEnd w:id="51"/>
-    </w:p>
-    <w:p>
-      <w:pPr>
-        <w:pStyle w:val="Heading3"/>
-        <w:rPr>
-          <w:lang w:val="en-US"/>
-        </w:rPr>
-      </w:pPr>
-      <w:bookmarkStart w:id="52" w:name="_Toc238200790"/>
-      <w:r>
-        <w:t>Security &amp; Anti</w:t>
-      </w:r>
-      <w:r>
-        <w:t>-</w:t>
-      </w:r>
-      <w:r>
-        <w:t>Fraud</w:t>
+      <w:bookmarkStart w:id="52" w:name="_Toc238200791"/>
+      <w:r>
+        <w:t>Usability &amp; UI/UX</w:t>
       </w:r>
       <w:bookmarkEnd w:id="52"/>
-    </w:p>
-    <w:p>
-      <w:pPr>
-        <w:pStyle w:val="Heading3"/>
-        <w:rPr>
-          <w:lang w:val="en-US"/>
-        </w:rPr>
-      </w:pPr>
-      <w:bookmarkStart w:id="53" w:name="_Toc238200791"/>
-      <w:r>
-        <w:t>Usability &amp; UI/UX</w:t>
-      </w:r>
-      <w:bookmarkEnd w:id="53"/>
     </w:p>
     <w:p>
       <w:pPr>
@@ -13816,11 +16200,11 @@
           <w:lang w:val="en-US"/>
         </w:rPr>
       </w:pPr>
-      <w:bookmarkStart w:id="54" w:name="_Toc238200792"/>
+      <w:bookmarkStart w:id="53" w:name="_Toc238200792"/>
       <w:r>
         <w:t>SYSTEM DESIGN</w:t>
       </w:r>
-      <w:bookmarkEnd w:id="54"/>
+      <w:bookmarkEnd w:id="53"/>
     </w:p>
     <w:p>
       <w:pPr>
@@ -13829,11 +16213,24 @@
           <w:lang w:val="en-US"/>
         </w:rPr>
       </w:pPr>
-      <w:bookmarkStart w:id="55" w:name="_Toc238200793"/>
+      <w:bookmarkStart w:id="54" w:name="_Toc238200793"/>
       <w:r>
         <w:lastRenderedPageBreak/>
         <w:t>System Architecture</w:t>
       </w:r>
+      <w:bookmarkEnd w:id="54"/>
+    </w:p>
+    <w:p>
+      <w:pPr>
+        <w:pStyle w:val="Heading3"/>
+        <w:rPr>
+          <w:lang w:val="en-US"/>
+        </w:rPr>
+      </w:pPr>
+      <w:bookmarkStart w:id="55" w:name="_Toc238200794"/>
+      <w:r>
+        <w:t>Client Layer</w:t>
+      </w:r>
       <w:bookmarkEnd w:id="55"/>
     </w:p>
     <w:p>
@@ -13843,9 +16240,9 @@
           <w:lang w:val="en-US"/>
         </w:rPr>
       </w:pPr>
-      <w:bookmarkStart w:id="56" w:name="_Toc238200794"/>
-      <w:r>
-        <w:t>Client Layer</w:t>
+      <w:bookmarkStart w:id="56" w:name="_Toc238200795"/>
+      <w:r>
+        <w:t>Load Balancing &amp; Proxy Layer</w:t>
       </w:r>
       <w:bookmarkEnd w:id="56"/>
     </w:p>
@@ -13856,9 +16253,9 @@
           <w:lang w:val="en-US"/>
         </w:rPr>
       </w:pPr>
-      <w:bookmarkStart w:id="57" w:name="_Toc238200795"/>
-      <w:r>
-        <w:t>Load Balancing &amp; Proxy Layer</w:t>
+      <w:bookmarkStart w:id="57" w:name="_Toc238200796"/>
+      <w:r>
+        <w:t>Application &amp; Service Layer (Node.js API)</w:t>
       </w:r>
       <w:bookmarkEnd w:id="57"/>
     </w:p>
@@ -13869,9 +16266,9 @@
           <w:lang w:val="en-US"/>
         </w:rPr>
       </w:pPr>
-      <w:bookmarkStart w:id="58" w:name="_Toc238200796"/>
-      <w:r>
-        <w:t>Application &amp; Service Layer (Node.js API)</w:t>
+      <w:bookmarkStart w:id="58" w:name="_Toc238200797"/>
+      <w:r>
+        <w:t>Message Broker Layer (RabbitMQ)</w:t>
       </w:r>
       <w:bookmarkEnd w:id="58"/>
     </w:p>
@@ -13882,9 +16279,15 @@
           <w:lang w:val="en-US"/>
         </w:rPr>
       </w:pPr>
-      <w:bookmarkStart w:id="59" w:name="_Toc238200797"/>
-      <w:r>
-        <w:t>Message Broker Layer (RabbitMQ)</w:t>
+      <w:bookmarkStart w:id="59" w:name="_Toc238200798"/>
+      <w:r>
+        <w:t>Caching &amp; In</w:t>
+      </w:r>
+      <w:r>
+        <w:t>-</w:t>
+      </w:r>
+      <w:r>
+        <w:t>Memory Storage (Redis)</w:t>
       </w:r>
       <w:bookmarkEnd w:id="59"/>
     </w:p>
@@ -13895,169 +16298,150 @@
           <w:lang w:val="en-US"/>
         </w:rPr>
       </w:pPr>
-      <w:bookmarkStart w:id="60" w:name="_Toc238200798"/>
-      <w:r>
-        <w:t>Caching &amp; In</w:t>
-      </w:r>
-      <w:r>
+      <w:bookmarkStart w:id="60" w:name="_Toc238200799"/>
+      <w:r>
+        <w:t>Database Layer (PostgreSQL)</w:t>
+      </w:r>
+      <w:bookmarkEnd w:id="60"/>
+    </w:p>
+    <w:p>
+      <w:pPr>
+        <w:pStyle w:val="Heading2"/>
+        <w:rPr>
+          <w:lang w:val="en-US"/>
+        </w:rPr>
+      </w:pPr>
+      <w:bookmarkStart w:id="61" w:name="_Toc238200800"/>
+      <w:r>
+        <w:t>ERD Diagram</w:t>
+      </w:r>
+      <w:bookmarkEnd w:id="61"/>
+    </w:p>
+    <w:p>
+      <w:pPr>
+        <w:pStyle w:val="Heading2"/>
+        <w:rPr>
+          <w:lang w:val="en-US"/>
+        </w:rPr>
+      </w:pPr>
+      <w:bookmarkStart w:id="62" w:name="_Toc238200801"/>
+      <w:r>
+        <w:t>Database Design</w:t>
+      </w:r>
+      <w:bookmarkEnd w:id="62"/>
+    </w:p>
+    <w:p>
+      <w:pPr>
+        <w:pStyle w:val="Heading2"/>
+        <w:rPr>
+          <w:lang w:val="en-US"/>
+        </w:rPr>
+      </w:pPr>
+      <w:bookmarkStart w:id="63" w:name="_Toc238200802"/>
+      <w:r>
+        <w:t>Sequence Diagrams</w:t>
+      </w:r>
+      <w:bookmarkEnd w:id="63"/>
+    </w:p>
+    <w:p>
+      <w:pPr>
+        <w:pStyle w:val="Heading3"/>
+        <w:rPr>
+          <w:lang w:val="en-US" w:eastAsia="zh-TW"/>
+        </w:rPr>
+      </w:pPr>
+      <w:bookmarkStart w:id="64" w:name="_Toc238200803"/>
+      <w:r>
+        <w:rPr>
+          <w:lang w:val="en-US" w:eastAsia="zh-TW"/>
+        </w:rPr>
+        <w:t>Organizer</w:t>
+      </w:r>
+      <w:r>
+        <w:rPr>
+          <w:lang w:val="en-US" w:eastAsia="zh-TW"/>
+        </w:rPr>
         <w:t>-</w:t>
       </w:r>
       <w:r>
-        <w:t>Memory Storage (Redis)</w:t>
-      </w:r>
-      <w:bookmarkEnd w:id="60"/>
+        <w:rPr>
+          <w:lang w:val="en-US" w:eastAsia="zh-TW"/>
+        </w:rPr>
+        <w:t>Scanned Attendance Flow</w:t>
+      </w:r>
+      <w:bookmarkEnd w:id="64"/>
     </w:p>
     <w:p>
       <w:pPr>
         <w:pStyle w:val="Heading3"/>
         <w:rPr>
-          <w:lang w:val="en-US"/>
-        </w:rPr>
-      </w:pPr>
-      <w:bookmarkStart w:id="61" w:name="_Toc238200799"/>
-      <w:r>
-        <w:t>Database Layer (PostgreSQL)</w:t>
-      </w:r>
-      <w:bookmarkEnd w:id="61"/>
+          <w:lang w:val="en-US" w:eastAsia="zh-TW"/>
+        </w:rPr>
+      </w:pPr>
+      <w:bookmarkStart w:id="65" w:name="_Toc238200804"/>
+      <w:r>
+        <w:rPr>
+          <w:lang w:val="en-US" w:eastAsia="zh-TW"/>
+        </w:rPr>
+        <w:t>Student Self</w:t>
+      </w:r>
+      <w:r>
+        <w:rPr>
+          <w:lang w:val="en-US" w:eastAsia="zh-TW"/>
+        </w:rPr>
+        <w:t>-</w:t>
+      </w:r>
+      <w:r>
+        <w:rPr>
+          <w:lang w:val="en-US" w:eastAsia="zh-TW"/>
+        </w:rPr>
+        <w:t>Check</w:t>
+      </w:r>
+      <w:r>
+        <w:rPr>
+          <w:lang w:val="en-US" w:eastAsia="zh-TW"/>
+        </w:rPr>
+        <w:t>-</w:t>
+      </w:r>
+      <w:r>
+        <w:rPr>
+          <w:lang w:val="en-US" w:eastAsia="zh-TW"/>
+        </w:rPr>
+        <w:t>in Flow via QR Code + GPS Geofencing</w:t>
+      </w:r>
+      <w:bookmarkEnd w:id="65"/>
+    </w:p>
+    <w:p>
+      <w:pPr>
+        <w:pStyle w:val="Heading3"/>
+        <w:rPr>
+          <w:lang w:val="en-US" w:eastAsia="zh-TW"/>
+        </w:rPr>
+      </w:pPr>
+      <w:bookmarkStart w:id="66" w:name="_Toc238200805"/>
+      <w:r>
+        <w:rPr>
+          <w:lang w:val="en-US" w:eastAsia="zh-TW"/>
+        </w:rPr>
+        <w:t>Smart Event Recommendation Flow</w:t>
+      </w:r>
+      <w:bookmarkEnd w:id="66"/>
     </w:p>
     <w:p>
       <w:pPr>
         <w:pStyle w:val="Heading2"/>
         <w:rPr>
-          <w:lang w:val="en-US"/>
-        </w:rPr>
-      </w:pPr>
-      <w:bookmarkStart w:id="62" w:name="_Toc238200800"/>
-      <w:r>
-        <w:t>ERD Diagram</w:t>
-      </w:r>
-      <w:bookmarkEnd w:id="62"/>
-    </w:p>
-    <w:p>
-      <w:pPr>
-        <w:pStyle w:val="Heading2"/>
-        <w:rPr>
-          <w:lang w:val="en-US"/>
-        </w:rPr>
-      </w:pPr>
-      <w:bookmarkStart w:id="63" w:name="_Toc238200801"/>
-      <w:r>
-        <w:t>Database Design</w:t>
-      </w:r>
-      <w:bookmarkEnd w:id="63"/>
-    </w:p>
-    <w:p>
-      <w:pPr>
-        <w:pStyle w:val="Heading2"/>
-        <w:rPr>
-          <w:lang w:val="en-US"/>
-        </w:rPr>
-      </w:pPr>
-      <w:bookmarkStart w:id="64" w:name="_Toc238200802"/>
-      <w:r>
-        <w:t>Sequence Diagrams</w:t>
-      </w:r>
-      <w:bookmarkEnd w:id="64"/>
-    </w:p>
-    <w:p>
-      <w:pPr>
-        <w:pStyle w:val="Heading3"/>
-        <w:rPr>
           <w:lang w:val="en-US" w:eastAsia="zh-TW"/>
         </w:rPr>
       </w:pPr>
-      <w:bookmarkStart w:id="65" w:name="_Toc238200803"/>
+      <w:bookmarkStart w:id="67" w:name="_Toc238200806"/>
       <w:r>
         <w:rPr>
           <w:lang w:val="en-US" w:eastAsia="zh-TW"/>
         </w:rPr>
-        <w:t>Organizer</w:t>
-      </w:r>
-      <w:r>
-        <w:rPr>
-          <w:lang w:val="en-US" w:eastAsia="zh-TW"/>
-        </w:rPr>
-        <w:t>-</w:t>
-      </w:r>
-      <w:r>
-        <w:rPr>
-          <w:lang w:val="en-US" w:eastAsia="zh-TW"/>
-        </w:rPr>
-        <w:t>Scanned Attendance Flow</w:t>
-      </w:r>
-      <w:bookmarkEnd w:id="65"/>
-    </w:p>
-    <w:p>
-      <w:pPr>
-        <w:pStyle w:val="Heading3"/>
-        <w:rPr>
-          <w:lang w:val="en-US" w:eastAsia="zh-TW"/>
-        </w:rPr>
-      </w:pPr>
-      <w:bookmarkStart w:id="66" w:name="_Toc238200804"/>
-      <w:r>
-        <w:rPr>
-          <w:lang w:val="en-US" w:eastAsia="zh-TW"/>
-        </w:rPr>
-        <w:t>Student Self</w:t>
-      </w:r>
-      <w:r>
-        <w:rPr>
-          <w:lang w:val="en-US" w:eastAsia="zh-TW"/>
-        </w:rPr>
-        <w:t>-</w:t>
-      </w:r>
-      <w:r>
-        <w:rPr>
-          <w:lang w:val="en-US" w:eastAsia="zh-TW"/>
-        </w:rPr>
-        <w:t>Check</w:t>
-      </w:r>
-      <w:r>
-        <w:rPr>
-          <w:lang w:val="en-US" w:eastAsia="zh-TW"/>
-        </w:rPr>
-        <w:t>-</w:t>
-      </w:r>
-      <w:r>
-        <w:rPr>
-          <w:lang w:val="en-US" w:eastAsia="zh-TW"/>
-        </w:rPr>
-        <w:t>in Flow via QR Code + GPS Geofencing</w:t>
-      </w:r>
-      <w:bookmarkEnd w:id="66"/>
-    </w:p>
-    <w:p>
-      <w:pPr>
-        <w:pStyle w:val="Heading3"/>
-        <w:rPr>
-          <w:lang w:val="en-US" w:eastAsia="zh-TW"/>
-        </w:rPr>
-      </w:pPr>
-      <w:bookmarkStart w:id="67" w:name="_Toc238200805"/>
-      <w:r>
-        <w:rPr>
-          <w:lang w:val="en-US" w:eastAsia="zh-TW"/>
-        </w:rPr>
-        <w:t>Smart Event Recommendation Flow</w:t>
+        <w:t>User Interface Design</w:t>
       </w:r>
       <w:bookmarkEnd w:id="67"/>
-    </w:p>
-    <w:p>
-      <w:pPr>
-        <w:pStyle w:val="Heading2"/>
-        <w:rPr>
-          <w:lang w:val="en-US" w:eastAsia="zh-TW"/>
-        </w:rPr>
-      </w:pPr>
-      <w:bookmarkStart w:id="68" w:name="_Toc238200806"/>
-      <w:r>
-        <w:rPr>
-          <w:lang w:val="en-US" w:eastAsia="zh-TW"/>
-        </w:rPr>
-        <w:t>User Interface Design</w:t>
-      </w:r>
-      <w:bookmarkEnd w:id="68"/>
     </w:p>
     <w:p>
       <w:pPr>
@@ -14076,11 +16460,27 @@
           <w:lang w:val="en-US"/>
         </w:rPr>
       </w:pPr>
-      <w:bookmarkStart w:id="69" w:name="_Toc238200807"/>
+      <w:bookmarkStart w:id="68" w:name="_Toc238200807"/>
       <w:r>
         <w:t>DEVELOPMENT AND TESTING</w:t>
       </w:r>
+      <w:bookmarkEnd w:id="68"/>
+    </w:p>
+    <w:p>
+      <w:pPr>
+        <w:pStyle w:val="Heading2"/>
+        <w:rPr>
+          <w:lang w:val="en-US"/>
+        </w:rPr>
+      </w:pPr>
+      <w:bookmarkStart w:id="69" w:name="_Toc238200808"/>
+      <w:r>
+        <w:t>Development Environment and Tools</w:t>
+      </w:r>
       <w:bookmarkEnd w:id="69"/>
+      <w:r>
+        <w:t xml:space="preserve"> </w:t>
+      </w:r>
     </w:p>
     <w:p>
       <w:pPr>
@@ -14089,9 +16489,9 @@
           <w:lang w:val="en-US"/>
         </w:rPr>
       </w:pPr>
-      <w:bookmarkStart w:id="70" w:name="_Toc238200808"/>
-      <w:r>
-        <w:t>Development Environment and Tools</w:t>
+      <w:bookmarkStart w:id="70" w:name="_Toc238200809"/>
+      <w:r>
+        <w:t>Source Code Structure &amp; Module Implementation</w:t>
       </w:r>
       <w:bookmarkEnd w:id="70"/>
       <w:r>
@@ -14105,11 +16505,24 @@
           <w:lang w:val="en-US"/>
         </w:rPr>
       </w:pPr>
-      <w:bookmarkStart w:id="71" w:name="_Toc238200809"/>
-      <w:r>
-        <w:t>Source Code Structure &amp; Module Implementation</w:t>
+      <w:bookmarkStart w:id="71" w:name="_Toc238200810"/>
+      <w:r>
+        <w:t>Infrastructure Deployment &amp; Load Balancing</w:t>
       </w:r>
       <w:bookmarkEnd w:id="71"/>
+    </w:p>
+    <w:p>
+      <w:pPr>
+        <w:pStyle w:val="Heading2"/>
+        <w:rPr>
+          <w:lang w:val="en-US"/>
+        </w:rPr>
+      </w:pPr>
+      <w:bookmarkStart w:id="72" w:name="_Toc238200811"/>
+      <w:r>
+        <w:t>System Testing Results</w:t>
+      </w:r>
+      <w:bookmarkEnd w:id="72"/>
       <w:r>
         <w:t xml:space="preserve"> </w:t>
       </w:r>
@@ -14121,40 +16534,11 @@
           <w:lang w:val="en-US"/>
         </w:rPr>
       </w:pPr>
-      <w:bookmarkStart w:id="72" w:name="_Toc238200810"/>
-      <w:r>
-        <w:t>Infrastructure Deployment &amp; Load Balancing</w:t>
-      </w:r>
-      <w:bookmarkEnd w:id="72"/>
-    </w:p>
-    <w:p>
-      <w:pPr>
-        <w:pStyle w:val="Heading2"/>
-        <w:rPr>
-          <w:lang w:val="en-US"/>
-        </w:rPr>
-      </w:pPr>
-      <w:bookmarkStart w:id="73" w:name="_Toc238200811"/>
-      <w:r>
-        <w:t>System Testing Results</w:t>
+      <w:bookmarkStart w:id="73" w:name="_Toc238200812"/>
+      <w:r>
+        <w:t>Challenges and Lessons Learned</w:t>
       </w:r>
       <w:bookmarkEnd w:id="73"/>
-      <w:r>
-        <w:t xml:space="preserve"> </w:t>
-      </w:r>
-    </w:p>
-    <w:p>
-      <w:pPr>
-        <w:pStyle w:val="Heading2"/>
-        <w:rPr>
-          <w:lang w:val="en-US"/>
-        </w:rPr>
-      </w:pPr>
-      <w:bookmarkStart w:id="74" w:name="_Toc238200812"/>
-      <w:r>
-        <w:t>Challenges and Lessons Learned</w:t>
-      </w:r>
-      <w:bookmarkEnd w:id="74"/>
     </w:p>
     <w:p>
       <w:pPr>
@@ -14165,11 +16549,11 @@
           <w:lang w:val="en-US"/>
         </w:rPr>
       </w:pPr>
-      <w:bookmarkStart w:id="75" w:name="_Toc238200813"/>
+      <w:bookmarkStart w:id="74" w:name="_Toc238200813"/>
       <w:r>
         <w:t>SYSTEM DEPLOYMENT AND EVALUATION</w:t>
       </w:r>
-      <w:bookmarkEnd w:id="75"/>
+      <w:bookmarkEnd w:id="74"/>
     </w:p>
     <w:p>
       <w:pPr>
@@ -14178,11 +16562,27 @@
           <w:lang w:val="en-US"/>
         </w:rPr>
       </w:pPr>
-      <w:bookmarkStart w:id="76" w:name="_Toc238200814"/>
+      <w:bookmarkStart w:id="75" w:name="_Toc238200814"/>
       <w:r>
         <w:lastRenderedPageBreak/>
         <w:t>Infrastructure Deployment Strategy</w:t>
       </w:r>
+      <w:bookmarkEnd w:id="75"/>
+      <w:r>
+        <w:t xml:space="preserve"> </w:t>
+      </w:r>
+    </w:p>
+    <w:p>
+      <w:pPr>
+        <w:pStyle w:val="Heading3"/>
+        <w:rPr>
+          <w:lang w:val="en-US"/>
+        </w:rPr>
+      </w:pPr>
+      <w:bookmarkStart w:id="76" w:name="_Toc238200815"/>
+      <w:r>
+        <w:t>Containerization with Docker &amp; Docker Compose</w:t>
+      </w:r>
       <w:bookmarkEnd w:id="76"/>
       <w:r>
         <w:t xml:space="preserve"> </w:t>
@@ -14195,11 +16595,24 @@
           <w:lang w:val="en-US"/>
         </w:rPr>
       </w:pPr>
-      <w:bookmarkStart w:id="77" w:name="_Toc238200815"/>
-      <w:r>
-        <w:t>Containerization with Docker &amp; Docker Compose</w:t>
+      <w:bookmarkStart w:id="77" w:name="_Toc238200816"/>
+      <w:r>
+        <w:t>Nginx Load Balancer Configuration</w:t>
       </w:r>
       <w:bookmarkEnd w:id="77"/>
+    </w:p>
+    <w:p>
+      <w:pPr>
+        <w:pStyle w:val="Heading2"/>
+        <w:rPr>
+          <w:lang w:val="en-US"/>
+        </w:rPr>
+      </w:pPr>
+      <w:bookmarkStart w:id="78" w:name="_Toc238200817"/>
+      <w:r>
+        <w:t>Load Testing and Performance Measurement</w:t>
+      </w:r>
+      <w:bookmarkEnd w:id="78"/>
       <w:r>
         <w:t xml:space="preserve"> </w:t>
       </w:r>
@@ -14211,11 +16624,27 @@
           <w:lang w:val="en-US"/>
         </w:rPr>
       </w:pPr>
-      <w:bookmarkStart w:id="78" w:name="_Toc238200816"/>
-      <w:r>
-        <w:t>Nginx Load Balancer Configuration</w:t>
-      </w:r>
-      <w:bookmarkEnd w:id="78"/>
+      <w:bookmarkStart w:id="79" w:name="_Toc238200818"/>
+      <w:r>
+        <w:t>Test Scenarios with k6</w:t>
+      </w:r>
+      <w:bookmarkEnd w:id="79"/>
+      <w:r>
+        <w:t xml:space="preserve"> </w:t>
+      </w:r>
+    </w:p>
+    <w:p>
+      <w:pPr>
+        <w:pStyle w:val="Heading3"/>
+        <w:rPr>
+          <w:lang w:val="en-US"/>
+        </w:rPr>
+      </w:pPr>
+      <w:bookmarkStart w:id="80" w:name="_Toc238200819"/>
+      <w:r>
+        <w:t>Actual Performance Metrics</w:t>
+      </w:r>
+      <w:bookmarkEnd w:id="80"/>
     </w:p>
     <w:p>
       <w:pPr>
@@ -14224,56 +16653,11 @@
           <w:lang w:val="en-US"/>
         </w:rPr>
       </w:pPr>
-      <w:bookmarkStart w:id="79" w:name="_Toc238200817"/>
-      <w:r>
-        <w:t>Load Testing and Performance Measurement</w:t>
-      </w:r>
-      <w:bookmarkEnd w:id="79"/>
-      <w:r>
-        <w:t xml:space="preserve"> </w:t>
-      </w:r>
-    </w:p>
-    <w:p>
-      <w:pPr>
-        <w:pStyle w:val="Heading3"/>
-        <w:rPr>
-          <w:lang w:val="en-US"/>
-        </w:rPr>
-      </w:pPr>
-      <w:bookmarkStart w:id="80" w:name="_Toc238200818"/>
-      <w:r>
-        <w:t>Test Scenarios with k6</w:t>
-      </w:r>
-      <w:bookmarkEnd w:id="80"/>
-      <w:r>
-        <w:t xml:space="preserve"> </w:t>
-      </w:r>
-    </w:p>
-    <w:p>
-      <w:pPr>
-        <w:pStyle w:val="Heading3"/>
-        <w:rPr>
-          <w:lang w:val="en-US"/>
-        </w:rPr>
-      </w:pPr>
-      <w:bookmarkStart w:id="81" w:name="_Toc238200819"/>
-      <w:r>
-        <w:t>Actual Performance Metrics</w:t>
+      <w:bookmarkStart w:id="81" w:name="_Toc238200820"/>
+      <w:r>
+        <w:t>Practical Business Impact Assessment</w:t>
       </w:r>
       <w:bookmarkEnd w:id="81"/>
-    </w:p>
-    <w:p>
-      <w:pPr>
-        <w:pStyle w:val="Heading2"/>
-        <w:rPr>
-          <w:lang w:val="en-US"/>
-        </w:rPr>
-      </w:pPr>
-      <w:bookmarkStart w:id="82" w:name="_Toc238200820"/>
-      <w:r>
-        <w:t>Practical Business Impact Assessment</w:t>
-      </w:r>
-      <w:bookmarkEnd w:id="82"/>
     </w:p>
     <w:p>
       <w:pPr>
@@ -14291,13 +16675,29 @@
           <w:lang w:val="en-US"/>
         </w:rPr>
       </w:pPr>
-      <w:bookmarkStart w:id="83" w:name="_Toc238200821"/>
+      <w:bookmarkStart w:id="82" w:name="_Toc238200821"/>
       <w:r>
         <w:rPr>
           <w:lang w:val="en-US"/>
         </w:rPr>
         <w:t>CONCLUSION</w:t>
       </w:r>
+      <w:bookmarkEnd w:id="82"/>
+    </w:p>
+    <w:p>
+      <w:pPr>
+        <w:pStyle w:val="Heading2"/>
+        <w:rPr>
+          <w:lang w:val="en-US" w:eastAsia="zh-TW"/>
+        </w:rPr>
+      </w:pPr>
+      <w:bookmarkStart w:id="83" w:name="_Toc238200822"/>
+      <w:r>
+        <w:rPr>
+          <w:lang w:val="en-US" w:eastAsia="zh-TW"/>
+        </w:rPr>
+        <w:t>Key Achievements</w:t>
+      </w:r>
       <w:bookmarkEnd w:id="83"/>
     </w:p>
     <w:p>
@@ -14307,12 +16707,12 @@
           <w:lang w:val="en-US" w:eastAsia="zh-TW"/>
         </w:rPr>
       </w:pPr>
-      <w:bookmarkStart w:id="84" w:name="_Toc238200822"/>
+      <w:bookmarkStart w:id="84" w:name="_Toc238200823"/>
       <w:r>
         <w:rPr>
           <w:lang w:val="en-US" w:eastAsia="zh-TW"/>
         </w:rPr>
-        <w:t>Key Achievements</w:t>
+        <w:t>Pros and Cons</w:t>
       </w:r>
       <w:bookmarkEnd w:id="84"/>
     </w:p>
@@ -14323,30 +16723,14 @@
           <w:lang w:val="en-US" w:eastAsia="zh-TW"/>
         </w:rPr>
       </w:pPr>
-      <w:bookmarkStart w:id="85" w:name="_Toc238200823"/>
+      <w:bookmarkStart w:id="85" w:name="_Toc238200824"/>
       <w:r>
         <w:rPr>
           <w:lang w:val="en-US" w:eastAsia="zh-TW"/>
         </w:rPr>
-        <w:t>Pros and Cons</w:t>
+        <w:t>Future Development Directions</w:t>
       </w:r>
       <w:bookmarkEnd w:id="85"/>
-    </w:p>
-    <w:p>
-      <w:pPr>
-        <w:pStyle w:val="Heading2"/>
-        <w:rPr>
-          <w:lang w:val="en-US" w:eastAsia="zh-TW"/>
-        </w:rPr>
-      </w:pPr>
-      <w:bookmarkStart w:id="86" w:name="_Toc238200824"/>
-      <w:r>
-        <w:rPr>
-          <w:lang w:val="en-US" w:eastAsia="zh-TW"/>
-        </w:rPr>
-        <w:t>Future Development Directions</w:t>
-      </w:r>
-      <w:bookmarkEnd w:id="86"/>
     </w:p>
     <w:p>
       <w:pPr>
@@ -14372,11 +16756,11 @@
       <w:r>
         <w:t>R</w:t>
       </w:r>
-      <w:bookmarkStart w:id="87" w:name="_Toc238200825"/>
+      <w:bookmarkStart w:id="86" w:name="_Toc238200825"/>
       <w:r>
         <w:t>EFERENCES</w:t>
       </w:r>
-      <w:bookmarkEnd w:id="87"/>
+      <w:bookmarkEnd w:id="86"/>
     </w:p>
     <w:p>
       <w:pPr>
@@ -14788,21 +17172,51 @@
           <w:iCs/>
         </w:rPr>
         <w:lastRenderedPageBreak/>
-        <w:t>Siregar, R., Maulana, B. ., Muhammad Isnaini, Elsa Sabrina, &amp; Hutahaean, H. D. . (2026). Performance Evaluation of a Mobile Attendance System Using Dual</w:t>
+        <w:t>Siregar, R., Maulana, B.</w:t>
       </w:r>
       <w:r>
         <w:rPr>
           <w:i/>
           <w:iCs/>
-        </w:rPr>
-        <w:t>-</w:t>
+          <w:lang w:val="en-US"/>
+        </w:rPr>
+        <w:t>.</w:t>
       </w:r>
       <w:r>
         <w:rPr>
           <w:i/>
           <w:iCs/>
         </w:rPr>
-        <w:t>Factor Dynamic Qr Code and Gps Geofencing. Jurnal Multimedia Dan Teknologi Informasi (Jatilima), 7(06), 1126–1134. https://doi.org/10.54209/jatilima.v7i06.2281</w:t>
+        <w:t>, Muhammad Isnaini, Elsa Sabrina, &amp; Hutahaean, H. D. . (2026). Performance Evaluation of a Mobile Attendance System Using Dual</w:t>
+      </w:r>
+      <w:r>
+        <w:rPr>
+          <w:i/>
+          <w:iCs/>
+        </w:rPr>
+        <w:t>-</w:t>
+      </w:r>
+      <w:r>
+        <w:rPr>
+          <w:i/>
+          <w:iCs/>
+        </w:rPr>
+        <w:t>Factor Dynamic Qr Code and Gps Geofencing. Jurnal Multimedia Dan Teknologi Informasi (Jatilima), 7(06),1126–1134.</w:t>
+      </w:r>
+      <w:r>
+        <w:rPr>
+          <w:i/>
+          <w:iCs/>
+          <w:lang w:val="en-US"/>
+        </w:rPr>
+        <w:t xml:space="preserve"> </w:t>
+      </w:r>
+      <w:r>
+        <w:rPr>
+          <w:i/>
+          <w:iCs/>
+        </w:rPr>
+        <w:t>https://doi.org/10.54209/jatilima.v7i06.2281</w:t>
       </w:r>
     </w:p>
     <w:sectPr>
@@ -14918,13 +17332,7 @@
           <w:rPr>
             <w:noProof/>
           </w:rPr>
-          <w:t>1</w:t>
-        </w:r>
-        <w:r>
-          <w:rPr>
-            <w:noProof/>
-          </w:rPr>
-          <w:t>6</w:t>
+          <w:t>16</w:t>
         </w:r>
         <w:r>
           <w:rPr>
@@ -17996,7 +20404,7 @@
       <w:lvlText w:val="CHAPTER %1. "/>
       <w:lvlJc w:val="left"/>
       <w:pPr>
-        <w:ind w:left="0" w:firstLine="0"/>
+        <w:ind w:left="8550" w:firstLine="0"/>
       </w:pPr>
       <w:rPr>
         <w:rFonts w:ascii="Times New Roman" w:hAnsi="Times New Roman" w:hint="default"/>
@@ -18693,13 +21101,14 @@
     <w:link w:val="Heading1Char"/>
     <w:uiPriority w:val="9"/>
     <w:qFormat/>
-    <w:rsid w:val="00F202B2"/>
+    <w:rsid w:val="005317C7"/>
     <w:pPr>
       <w:keepNext/>
       <w:keepLines/>
       <w:numPr>
         <w:numId w:val="1"/>
       </w:numPr>
+      <w:ind w:left="0"/>
       <w:outlineLvl w:val="0"/>
     </w:pPr>
     <w:rPr>
@@ -18772,7 +21181,7 @@
     <w:uiPriority w:val="9"/>
     <w:unhideWhenUsed/>
     <w:qFormat/>
-    <w:rsid w:val="00F202B2"/>
+    <w:rsid w:val="00274D44"/>
     <w:pPr>
       <w:keepNext/>
       <w:keepLines/>
@@ -18780,6 +21189,7 @@
         <w:ilvl w:val="3"/>
         <w:numId w:val="1"/>
       </w:numPr>
+      <w:ind w:left="0"/>
       <w:outlineLvl w:val="3"/>
     </w:pPr>
     <w:rPr>
@@ -18851,7 +21261,7 @@
     <w:basedOn w:val="DefaultParagraphFont"/>
     <w:link w:val="Heading1"/>
     <w:uiPriority w:val="9"/>
-    <w:rsid w:val="00F202B2"/>
+    <w:rsid w:val="005317C7"/>
     <w:rPr>
       <w:rFonts w:ascii="Times New Roman" w:eastAsiaTheme="majorEastAsia" w:hAnsi="Times New Roman" w:cstheme="majorBidi"/>
       <w:b/>
@@ -18895,7 +21305,7 @@
     <w:basedOn w:val="DefaultParagraphFont"/>
     <w:link w:val="Heading4"/>
     <w:uiPriority w:val="9"/>
-    <w:rsid w:val="00F202B2"/>
+    <w:rsid w:val="00274D44"/>
     <w:rPr>
       <w:rFonts w:ascii="Times New Roman" w:eastAsiaTheme="majorEastAsia" w:hAnsi="Times New Roman" w:cstheme="majorBidi"/>
       <w:iCs/>

</xml_diff>